<commit_message>
Build Elyra Suite website owner's handbook
</commit_message>
<xml_diff>
--- a/docs/Elyra_Suite_Website_Owners_Handbook.docx
+++ b/docs/Elyra_Suite_Website_Owners_Handbook.docx
@@ -110,6 +110,10 @@
         <w:gridCol w:w="4989"/>
       </w:tblGrid>
       <w:tr>
+        <w:trPr>
+          <w:cantSplit/>
+          <w:tblHeader w:val="true"/>
+        </w:trPr>
         <w:tc>
           <w:tcPr>
             <w:tcW w:type="dxa" w:w="4989"/>
@@ -160,6 +164,9 @@
         </w:tc>
       </w:tr>
       <w:tr>
+        <w:trPr>
+          <w:cantSplit/>
+        </w:trPr>
         <w:tc>
           <w:tcPr>
             <w:tcW w:type="dxa" w:w="4989"/>
@@ -210,6 +217,9 @@
         </w:tc>
       </w:tr>
       <w:tr>
+        <w:trPr>
+          <w:cantSplit/>
+        </w:trPr>
         <w:tc>
           <w:tcPr>
             <w:tcW w:type="dxa" w:w="4989"/>
@@ -260,6 +270,9 @@
         </w:tc>
       </w:tr>
       <w:tr>
+        <w:trPr>
+          <w:cantSplit/>
+        </w:trPr>
         <w:tc>
           <w:tcPr>
             <w:tcW w:type="dxa" w:w="4989"/>
@@ -356,6 +369,10 @@
         <w:gridCol w:w="9978"/>
       </w:tblGrid>
       <w:tr>
+        <w:trPr>
+          <w:cantSplit/>
+          <w:tblHeader w:val="true"/>
+        </w:trPr>
         <w:tc>
           <w:tcPr>
             <w:tcW w:type="dxa" w:w="9978"/>
@@ -420,6 +437,10 @@
         <w:gridCol w:w="3326"/>
       </w:tblGrid>
       <w:tr>
+        <w:trPr>
+          <w:cantSplit/>
+          <w:tblHeader w:val="true"/>
+        </w:trPr>
         <w:tc>
           <w:tcPr>
             <w:tcW w:type="dxa" w:w="1871"/>
@@ -509,6 +530,9 @@
         </w:tc>
       </w:tr>
       <w:tr>
+        <w:trPr>
+          <w:cantSplit/>
+        </w:trPr>
         <w:tc>
           <w:tcPr>
             <w:tcW w:type="dxa" w:w="1871"/>
@@ -592,6 +616,9 @@
         </w:tc>
       </w:tr>
       <w:tr>
+        <w:trPr>
+          <w:cantSplit/>
+        </w:trPr>
         <w:tc>
           <w:tcPr>
             <w:tcW w:type="dxa" w:w="1871"/>
@@ -675,6 +702,9 @@
         </w:tc>
       </w:tr>
       <w:tr>
+        <w:trPr>
+          <w:cantSplit/>
+        </w:trPr>
         <w:tc>
           <w:tcPr>
             <w:tcW w:type="dxa" w:w="1871"/>
@@ -916,6 +946,10 @@
         <w:gridCol w:w="9978"/>
       </w:tblGrid>
       <w:tr>
+        <w:trPr>
+          <w:cantSplit/>
+          <w:tblHeader w:val="true"/>
+        </w:trPr>
         <w:tc>
           <w:tcPr>
             <w:tcW w:type="dxa" w:w="9978"/>
@@ -1078,6 +1112,10 @@
         <w:gridCol w:w="2494"/>
       </w:tblGrid>
       <w:tr>
+        <w:trPr>
+          <w:cantSplit/>
+          <w:tblHeader w:val="true"/>
+        </w:trPr>
         <w:tc>
           <w:tcPr>
             <w:tcW w:type="dxa" w:w="2494"/>
@@ -1196,6 +1234,9 @@
         </w:tc>
       </w:tr>
       <w:tr>
+        <w:trPr>
+          <w:cantSplit/>
+        </w:trPr>
         <w:tc>
           <w:tcPr>
             <w:tcW w:type="dxa" w:w="2494"/>
@@ -1306,6 +1347,9 @@
         </w:tc>
       </w:tr>
       <w:tr>
+        <w:trPr>
+          <w:cantSplit/>
+        </w:trPr>
         <w:tc>
           <w:tcPr>
             <w:tcW w:type="dxa" w:w="2494"/>
@@ -1416,6 +1460,9 @@
         </w:tc>
       </w:tr>
       <w:tr>
+        <w:trPr>
+          <w:cantSplit/>
+        </w:trPr>
         <w:tc>
           <w:tcPr>
             <w:tcW w:type="dxa" w:w="2494"/>
@@ -1526,6 +1573,9 @@
         </w:tc>
       </w:tr>
       <w:tr>
+        <w:trPr>
+          <w:cantSplit/>
+        </w:trPr>
         <w:tc>
           <w:tcPr>
             <w:tcW w:type="dxa" w:w="2494"/>
@@ -1636,6 +1686,9 @@
         </w:tc>
       </w:tr>
       <w:tr>
+        <w:trPr>
+          <w:cantSplit/>
+        </w:trPr>
         <w:tc>
           <w:tcPr>
             <w:tcW w:type="dxa" w:w="2494"/>
@@ -1746,6 +1799,9 @@
         </w:tc>
       </w:tr>
       <w:tr>
+        <w:trPr>
+          <w:cantSplit/>
+        </w:trPr>
         <w:tc>
           <w:tcPr>
             <w:tcW w:type="dxa" w:w="2494"/>
@@ -1856,6 +1912,9 @@
         </w:tc>
       </w:tr>
       <w:tr>
+        <w:trPr>
+          <w:cantSplit/>
+        </w:trPr>
         <w:tc>
           <w:tcPr>
             <w:tcW w:type="dxa" w:w="2494"/>
@@ -1966,6 +2025,9 @@
         </w:tc>
       </w:tr>
       <w:tr>
+        <w:trPr>
+          <w:cantSplit/>
+        </w:trPr>
         <w:tc>
           <w:tcPr>
             <w:tcW w:type="dxa" w:w="2494"/>
@@ -2076,6 +2138,9 @@
         </w:tc>
       </w:tr>
       <w:tr>
+        <w:trPr>
+          <w:cantSplit/>
+        </w:trPr>
         <w:tc>
           <w:tcPr>
             <w:tcW w:type="dxa" w:w="2494"/>
@@ -2186,6 +2251,9 @@
         </w:tc>
       </w:tr>
       <w:tr>
+        <w:trPr>
+          <w:cantSplit/>
+        </w:trPr>
         <w:tc>
           <w:tcPr>
             <w:tcW w:type="dxa" w:w="2494"/>
@@ -2296,6 +2364,9 @@
         </w:tc>
       </w:tr>
       <w:tr>
+        <w:trPr>
+          <w:cantSplit/>
+        </w:trPr>
         <w:tc>
           <w:tcPr>
             <w:tcW w:type="dxa" w:w="2494"/>
@@ -2406,6 +2477,9 @@
         </w:tc>
       </w:tr>
       <w:tr>
+        <w:trPr>
+          <w:cantSplit/>
+        </w:trPr>
         <w:tc>
           <w:tcPr>
             <w:tcW w:type="dxa" w:w="2494"/>
@@ -2516,6 +2590,9 @@
         </w:tc>
       </w:tr>
       <w:tr>
+        <w:trPr>
+          <w:cantSplit/>
+        </w:trPr>
         <w:tc>
           <w:tcPr>
             <w:tcW w:type="dxa" w:w="2494"/>
@@ -2626,6 +2703,9 @@
         </w:tc>
       </w:tr>
       <w:tr>
+        <w:trPr>
+          <w:cantSplit/>
+        </w:trPr>
         <w:tc>
           <w:tcPr>
             <w:tcW w:type="dxa" w:w="2494"/>
@@ -2736,6 +2816,9 @@
         </w:tc>
       </w:tr>
       <w:tr>
+        <w:trPr>
+          <w:cantSplit/>
+        </w:trPr>
         <w:tc>
           <w:tcPr>
             <w:tcW w:type="dxa" w:w="2494"/>
@@ -2846,6 +2929,9 @@
         </w:tc>
       </w:tr>
       <w:tr>
+        <w:trPr>
+          <w:cantSplit/>
+        </w:trPr>
         <w:tc>
           <w:tcPr>
             <w:tcW w:type="dxa" w:w="2494"/>
@@ -2956,6 +3042,9 @@
         </w:tc>
       </w:tr>
       <w:tr>
+        <w:trPr>
+          <w:cantSplit/>
+        </w:trPr>
         <w:tc>
           <w:tcPr>
             <w:tcW w:type="dxa" w:w="2494"/>
@@ -3066,6 +3155,9 @@
         </w:tc>
       </w:tr>
       <w:tr>
+        <w:trPr>
+          <w:cantSplit/>
+        </w:trPr>
         <w:tc>
           <w:tcPr>
             <w:tcW w:type="dxa" w:w="2494"/>
@@ -3176,6 +3268,9 @@
         </w:tc>
       </w:tr>
       <w:tr>
+        <w:trPr>
+          <w:cantSplit/>
+        </w:trPr>
         <w:tc>
           <w:tcPr>
             <w:tcW w:type="dxa" w:w="2494"/>
@@ -3286,6 +3381,9 @@
         </w:tc>
       </w:tr>
       <w:tr>
+        <w:trPr>
+          <w:cantSplit/>
+        </w:trPr>
         <w:tc>
           <w:tcPr>
             <w:tcW w:type="dxa" w:w="2494"/>
@@ -3611,6 +3709,10 @@
         <w:gridCol w:w="9978"/>
       </w:tblGrid>
       <w:tr>
+        <w:trPr>
+          <w:cantSplit/>
+          <w:tblHeader w:val="true"/>
+        </w:trPr>
         <w:tc>
           <w:tcPr>
             <w:tcW w:type="dxa" w:w="9978"/>
@@ -3666,6 +3768,10 @@
         <w:gridCol w:w="9978"/>
       </w:tblGrid>
       <w:tr>
+        <w:trPr>
+          <w:cantSplit/>
+          <w:tblHeader w:val="true"/>
+        </w:trPr>
         <w:tc>
           <w:tcPr>
             <w:tcW w:type="dxa" w:w="9978"/>
@@ -3729,6 +3835,10 @@
         <w:gridCol w:w="4989"/>
       </w:tblGrid>
       <w:tr>
+        <w:trPr>
+          <w:cantSplit/>
+          <w:tblHeader w:val="true"/>
+        </w:trPr>
         <w:tc>
           <w:tcPr>
             <w:tcW w:type="dxa" w:w="2324"/>
@@ -3789,6 +3899,9 @@
         </w:tc>
       </w:tr>
       <w:tr>
+        <w:trPr>
+          <w:cantSplit/>
+        </w:trPr>
         <w:tc>
           <w:tcPr>
             <w:tcW w:type="dxa" w:w="2324"/>
@@ -3845,6 +3958,9 @@
         </w:tc>
       </w:tr>
       <w:tr>
+        <w:trPr>
+          <w:cantSplit/>
+        </w:trPr>
         <w:tc>
           <w:tcPr>
             <w:tcW w:type="dxa" w:w="2324"/>
@@ -3901,6 +4017,9 @@
         </w:tc>
       </w:tr>
       <w:tr>
+        <w:trPr>
+          <w:cantSplit/>
+        </w:trPr>
         <w:tc>
           <w:tcPr>
             <w:tcW w:type="dxa" w:w="2324"/>
@@ -3957,6 +4076,9 @@
         </w:tc>
       </w:tr>
       <w:tr>
+        <w:trPr>
+          <w:cantSplit/>
+        </w:trPr>
         <w:tc>
           <w:tcPr>
             <w:tcW w:type="dxa" w:w="2324"/>
@@ -4013,6 +4135,9 @@
         </w:tc>
       </w:tr>
       <w:tr>
+        <w:trPr>
+          <w:cantSplit/>
+        </w:trPr>
         <w:tc>
           <w:tcPr>
             <w:tcW w:type="dxa" w:w="2324"/>
@@ -4069,6 +4194,9 @@
         </w:tc>
       </w:tr>
       <w:tr>
+        <w:trPr>
+          <w:cantSplit/>
+        </w:trPr>
         <w:tc>
           <w:tcPr>
             <w:tcW w:type="dxa" w:w="2324"/>
@@ -4125,6 +4253,9 @@
         </w:tc>
       </w:tr>
       <w:tr>
+        <w:trPr>
+          <w:cantSplit/>
+        </w:trPr>
         <w:tc>
           <w:tcPr>
             <w:tcW w:type="dxa" w:w="2324"/>
@@ -4181,6 +4312,9 @@
         </w:tc>
       </w:tr>
       <w:tr>
+        <w:trPr>
+          <w:cantSplit/>
+        </w:trPr>
         <w:tc>
           <w:tcPr>
             <w:tcW w:type="dxa" w:w="2324"/>
@@ -4237,6 +4371,9 @@
         </w:tc>
       </w:tr>
       <w:tr>
+        <w:trPr>
+          <w:cantSplit/>
+        </w:trPr>
         <w:tc>
           <w:tcPr>
             <w:tcW w:type="dxa" w:w="2324"/>
@@ -4293,6 +4430,9 @@
         </w:tc>
       </w:tr>
       <w:tr>
+        <w:trPr>
+          <w:cantSplit/>
+        </w:trPr>
         <w:tc>
           <w:tcPr>
             <w:tcW w:type="dxa" w:w="2324"/>
@@ -4349,6 +4489,9 @@
         </w:tc>
       </w:tr>
       <w:tr>
+        <w:trPr>
+          <w:cantSplit/>
+        </w:trPr>
         <w:tc>
           <w:tcPr>
             <w:tcW w:type="dxa" w:w="2324"/>
@@ -4405,6 +4548,9 @@
         </w:tc>
       </w:tr>
       <w:tr>
+        <w:trPr>
+          <w:cantSplit/>
+        </w:trPr>
         <w:tc>
           <w:tcPr>
             <w:tcW w:type="dxa" w:w="2324"/>
@@ -4461,6 +4607,9 @@
         </w:tc>
       </w:tr>
       <w:tr>
+        <w:trPr>
+          <w:cantSplit/>
+        </w:trPr>
         <w:tc>
           <w:tcPr>
             <w:tcW w:type="dxa" w:w="2324"/>
@@ -4517,6 +4666,9 @@
         </w:tc>
       </w:tr>
       <w:tr>
+        <w:trPr>
+          <w:cantSplit/>
+        </w:trPr>
         <w:tc>
           <w:tcPr>
             <w:tcW w:type="dxa" w:w="2324"/>
@@ -4573,6 +4725,9 @@
         </w:tc>
       </w:tr>
       <w:tr>
+        <w:trPr>
+          <w:cantSplit/>
+        </w:trPr>
         <w:tc>
           <w:tcPr>
             <w:tcW w:type="dxa" w:w="2324"/>
@@ -4629,6 +4784,9 @@
         </w:tc>
       </w:tr>
       <w:tr>
+        <w:trPr>
+          <w:cantSplit/>
+        </w:trPr>
         <w:tc>
           <w:tcPr>
             <w:tcW w:type="dxa" w:w="2324"/>
@@ -4685,6 +4843,9 @@
         </w:tc>
       </w:tr>
       <w:tr>
+        <w:trPr>
+          <w:cantSplit/>
+        </w:trPr>
         <w:tc>
           <w:tcPr>
             <w:tcW w:type="dxa" w:w="2324"/>
@@ -4741,6 +4902,9 @@
         </w:tc>
       </w:tr>
       <w:tr>
+        <w:trPr>
+          <w:cantSplit/>
+        </w:trPr>
         <w:tc>
           <w:tcPr>
             <w:tcW w:type="dxa" w:w="2324"/>
@@ -4832,6 +4996,10 @@
         <w:gridCol w:w="4989"/>
       </w:tblGrid>
       <w:tr>
+        <w:trPr>
+          <w:cantSplit/>
+          <w:tblHeader w:val="true"/>
+        </w:trPr>
         <w:tc>
           <w:tcPr>
             <w:tcW w:type="dxa" w:w="4989"/>
@@ -4892,6 +5060,9 @@
         </w:tc>
       </w:tr>
       <w:tr>
+        <w:trPr>
+          <w:cantSplit/>
+        </w:trPr>
         <w:tc>
           <w:tcPr>
             <w:tcW w:type="dxa" w:w="4989"/>
@@ -4948,6 +5119,9 @@
         </w:tc>
       </w:tr>
       <w:tr>
+        <w:trPr>
+          <w:cantSplit/>
+        </w:trPr>
         <w:tc>
           <w:tcPr>
             <w:tcW w:type="dxa" w:w="4989"/>
@@ -5004,6 +5178,9 @@
         </w:tc>
       </w:tr>
       <w:tr>
+        <w:trPr>
+          <w:cantSplit/>
+        </w:trPr>
         <w:tc>
           <w:tcPr>
             <w:tcW w:type="dxa" w:w="4989"/>
@@ -5060,6 +5237,9 @@
         </w:tc>
       </w:tr>
       <w:tr>
+        <w:trPr>
+          <w:cantSplit/>
+        </w:trPr>
         <w:tc>
           <w:tcPr>
             <w:tcW w:type="dxa" w:w="4989"/>
@@ -5116,6 +5296,9 @@
         </w:tc>
       </w:tr>
       <w:tr>
+        <w:trPr>
+          <w:cantSplit/>
+        </w:trPr>
         <w:tc>
           <w:tcPr>
             <w:tcW w:type="dxa" w:w="4989"/>
@@ -5172,6 +5355,9 @@
         </w:tc>
       </w:tr>
       <w:tr>
+        <w:trPr>
+          <w:cantSplit/>
+        </w:trPr>
         <w:tc>
           <w:tcPr>
             <w:tcW w:type="dxa" w:w="4989"/>
@@ -5228,6 +5414,9 @@
         </w:tc>
       </w:tr>
       <w:tr>
+        <w:trPr>
+          <w:cantSplit/>
+        </w:trPr>
         <w:tc>
           <w:tcPr>
             <w:tcW w:type="dxa" w:w="4989"/>
@@ -5311,6 +5500,10 @@
         <w:gridCol w:w="3326"/>
       </w:tblGrid>
       <w:tr>
+        <w:trPr>
+          <w:cantSplit/>
+          <w:tblHeader w:val="true"/>
+        </w:trPr>
         <w:tc>
           <w:tcPr>
             <w:tcW w:type="dxa" w:w="3326"/>
@@ -5400,6 +5593,9 @@
         </w:tc>
       </w:tr>
       <w:tr>
+        <w:trPr>
+          <w:cantSplit/>
+        </w:trPr>
         <w:tc>
           <w:tcPr>
             <w:tcW w:type="dxa" w:w="3326"/>
@@ -5483,6 +5679,9 @@
         </w:tc>
       </w:tr>
       <w:tr>
+        <w:trPr>
+          <w:cantSplit/>
+        </w:trPr>
         <w:tc>
           <w:tcPr>
             <w:tcW w:type="dxa" w:w="3326"/>
@@ -5566,6 +5765,9 @@
         </w:tc>
       </w:tr>
       <w:tr>
+        <w:trPr>
+          <w:cantSplit/>
+        </w:trPr>
         <w:tc>
           <w:tcPr>
             <w:tcW w:type="dxa" w:w="3326"/>
@@ -5649,6 +5851,9 @@
         </w:tc>
       </w:tr>
       <w:tr>
+        <w:trPr>
+          <w:cantSplit/>
+        </w:trPr>
         <w:tc>
           <w:tcPr>
             <w:tcW w:type="dxa" w:w="3326"/>
@@ -5732,6 +5937,9 @@
         </w:tc>
       </w:tr>
       <w:tr>
+        <w:trPr>
+          <w:cantSplit/>
+        </w:trPr>
         <w:tc>
           <w:tcPr>
             <w:tcW w:type="dxa" w:w="3326"/>
@@ -5849,6 +6057,10 @@
         <w:gridCol w:w="9978"/>
       </w:tblGrid>
       <w:tr>
+        <w:trPr>
+          <w:cantSplit/>
+          <w:tblHeader w:val="true"/>
+        </w:trPr>
         <w:tc>
           <w:tcPr>
             <w:tcW w:type="dxa" w:w="9978"/>
@@ -5942,6 +6154,10 @@
         <w:gridCol w:w="9978"/>
       </w:tblGrid>
       <w:tr>
+        <w:trPr>
+          <w:cantSplit/>
+          <w:tblHeader w:val="true"/>
+        </w:trPr>
         <w:tc>
           <w:tcPr>
             <w:tcW w:type="dxa" w:w="9978"/>
@@ -6017,6 +6233,10 @@
         <w:gridCol w:w="3326"/>
       </w:tblGrid>
       <w:tr>
+        <w:trPr>
+          <w:cantSplit/>
+          <w:tblHeader w:val="true"/>
+        </w:trPr>
         <w:tc>
           <w:tcPr>
             <w:tcW w:type="dxa" w:w="2494"/>
@@ -6106,6 +6326,9 @@
         </w:tc>
       </w:tr>
       <w:tr>
+        <w:trPr>
+          <w:cantSplit/>
+        </w:trPr>
         <w:tc>
           <w:tcPr>
             <w:tcW w:type="dxa" w:w="2494"/>
@@ -6189,6 +6412,9 @@
         </w:tc>
       </w:tr>
       <w:tr>
+        <w:trPr>
+          <w:cantSplit/>
+        </w:trPr>
         <w:tc>
           <w:tcPr>
             <w:tcW w:type="dxa" w:w="2494"/>
@@ -6272,6 +6498,9 @@
         </w:tc>
       </w:tr>
       <w:tr>
+        <w:trPr>
+          <w:cantSplit/>
+        </w:trPr>
         <w:tc>
           <w:tcPr>
             <w:tcW w:type="dxa" w:w="2494"/>
@@ -6355,6 +6584,9 @@
         </w:tc>
       </w:tr>
       <w:tr>
+        <w:trPr>
+          <w:cantSplit/>
+        </w:trPr>
         <w:tc>
           <w:tcPr>
             <w:tcW w:type="dxa" w:w="2494"/>
@@ -6438,6 +6670,9 @@
         </w:tc>
       </w:tr>
       <w:tr>
+        <w:trPr>
+          <w:cantSplit/>
+        </w:trPr>
         <w:tc>
           <w:tcPr>
             <w:tcW w:type="dxa" w:w="2494"/>
@@ -6521,6 +6756,9 @@
         </w:tc>
       </w:tr>
       <w:tr>
+        <w:trPr>
+          <w:cantSplit/>
+        </w:trPr>
         <w:tc>
           <w:tcPr>
             <w:tcW w:type="dxa" w:w="2494"/>
@@ -6604,6 +6842,9 @@
         </w:tc>
       </w:tr>
       <w:tr>
+        <w:trPr>
+          <w:cantSplit/>
+        </w:trPr>
         <w:tc>
           <w:tcPr>
             <w:tcW w:type="dxa" w:w="2494"/>
@@ -6687,6 +6928,9 @@
         </w:tc>
       </w:tr>
       <w:tr>
+        <w:trPr>
+          <w:cantSplit/>
+        </w:trPr>
         <w:tc>
           <w:tcPr>
             <w:tcW w:type="dxa" w:w="2494"/>
@@ -6770,6 +7014,9 @@
         </w:tc>
       </w:tr>
       <w:tr>
+        <w:trPr>
+          <w:cantSplit/>
+        </w:trPr>
         <w:tc>
           <w:tcPr>
             <w:tcW w:type="dxa" w:w="2494"/>
@@ -6853,6 +7100,9 @@
         </w:tc>
       </w:tr>
       <w:tr>
+        <w:trPr>
+          <w:cantSplit/>
+        </w:trPr>
         <w:tc>
           <w:tcPr>
             <w:tcW w:type="dxa" w:w="2494"/>
@@ -6936,6 +7186,9 @@
         </w:tc>
       </w:tr>
       <w:tr>
+        <w:trPr>
+          <w:cantSplit/>
+        </w:trPr>
         <w:tc>
           <w:tcPr>
             <w:tcW w:type="dxa" w:w="2494"/>
@@ -7019,6 +7272,9 @@
         </w:tc>
       </w:tr>
       <w:tr>
+        <w:trPr>
+          <w:cantSplit/>
+        </w:trPr>
         <w:tc>
           <w:tcPr>
             <w:tcW w:type="dxa" w:w="2494"/>
@@ -7102,6 +7358,9 @@
         </w:tc>
       </w:tr>
       <w:tr>
+        <w:trPr>
+          <w:cantSplit/>
+        </w:trPr>
         <w:tc>
           <w:tcPr>
             <w:tcW w:type="dxa" w:w="2494"/>
@@ -7185,6 +7444,9 @@
         </w:tc>
       </w:tr>
       <w:tr>
+        <w:trPr>
+          <w:cantSplit/>
+        </w:trPr>
         <w:tc>
           <w:tcPr>
             <w:tcW w:type="dxa" w:w="2494"/>
@@ -7268,6 +7530,9 @@
         </w:tc>
       </w:tr>
       <w:tr>
+        <w:trPr>
+          <w:cantSplit/>
+        </w:trPr>
         <w:tc>
           <w:tcPr>
             <w:tcW w:type="dxa" w:w="2494"/>
@@ -7351,6 +7616,9 @@
         </w:tc>
       </w:tr>
       <w:tr>
+        <w:trPr>
+          <w:cantSplit/>
+        </w:trPr>
         <w:tc>
           <w:tcPr>
             <w:tcW w:type="dxa" w:w="2494"/>
@@ -7434,6 +7702,9 @@
         </w:tc>
       </w:tr>
       <w:tr>
+        <w:trPr>
+          <w:cantSplit/>
+        </w:trPr>
         <w:tc>
           <w:tcPr>
             <w:tcW w:type="dxa" w:w="2494"/>
@@ -7517,6 +7788,9 @@
         </w:tc>
       </w:tr>
       <w:tr>
+        <w:trPr>
+          <w:cantSplit/>
+        </w:trPr>
         <w:tc>
           <w:tcPr>
             <w:tcW w:type="dxa" w:w="2494"/>
@@ -7616,6 +7890,10 @@
         <w:gridCol w:w="9978"/>
       </w:tblGrid>
       <w:tr>
+        <w:trPr>
+          <w:cantSplit/>
+          <w:tblHeader w:val="true"/>
+        </w:trPr>
         <w:tc>
           <w:tcPr>
             <w:tcW w:type="dxa" w:w="9978"/>
@@ -7696,6 +7974,10 @@
         <w:gridCol w:w="9978"/>
       </w:tblGrid>
       <w:tr>
+        <w:trPr>
+          <w:cantSplit/>
+          <w:tblHeader w:val="true"/>
+        </w:trPr>
         <w:tc>
           <w:tcPr>
             <w:tcW w:type="dxa" w:w="9978"/>
@@ -7826,6 +8108,10 @@
         <w:gridCol w:w="9978"/>
       </w:tblGrid>
       <w:tr>
+        <w:trPr>
+          <w:cantSplit/>
+          <w:tblHeader w:val="true"/>
+        </w:trPr>
         <w:tc>
           <w:tcPr>
             <w:tcW w:type="dxa" w:w="9978"/>
@@ -7886,6 +8172,10 @@
         <w:gridCol w:w="3326"/>
       </w:tblGrid>
       <w:tr>
+        <w:trPr>
+          <w:cantSplit/>
+          <w:tblHeader w:val="true"/>
+        </w:trPr>
         <w:tc>
           <w:tcPr>
             <w:tcW w:type="dxa" w:w="3326"/>
@@ -7975,6 +8265,9 @@
         </w:tc>
       </w:tr>
       <w:tr>
+        <w:trPr>
+          <w:cantSplit/>
+        </w:trPr>
         <w:tc>
           <w:tcPr>
             <w:tcW w:type="dxa" w:w="3326"/>
@@ -8058,6 +8351,9 @@
         </w:tc>
       </w:tr>
       <w:tr>
+        <w:trPr>
+          <w:cantSplit/>
+        </w:trPr>
         <w:tc>
           <w:tcPr>
             <w:tcW w:type="dxa" w:w="3326"/>
@@ -8141,6 +8437,9 @@
         </w:tc>
       </w:tr>
       <w:tr>
+        <w:trPr>
+          <w:cantSplit/>
+        </w:trPr>
         <w:tc>
           <w:tcPr>
             <w:tcW w:type="dxa" w:w="3326"/>
@@ -8224,6 +8523,9 @@
         </w:tc>
       </w:tr>
       <w:tr>
+        <w:trPr>
+          <w:cantSplit/>
+        </w:trPr>
         <w:tc>
           <w:tcPr>
             <w:tcW w:type="dxa" w:w="3326"/>
@@ -8307,6 +8609,9 @@
         </w:tc>
       </w:tr>
       <w:tr>
+        <w:trPr>
+          <w:cantSplit/>
+        </w:trPr>
         <w:tc>
           <w:tcPr>
             <w:tcW w:type="dxa" w:w="3326"/>
@@ -8390,6 +8695,9 @@
         </w:tc>
       </w:tr>
       <w:tr>
+        <w:trPr>
+          <w:cantSplit/>
+        </w:trPr>
         <w:tc>
           <w:tcPr>
             <w:tcW w:type="dxa" w:w="3326"/>
@@ -8473,6 +8781,9 @@
         </w:tc>
       </w:tr>
       <w:tr>
+        <w:trPr>
+          <w:cantSplit/>
+        </w:trPr>
         <w:tc>
           <w:tcPr>
             <w:tcW w:type="dxa" w:w="3326"/>
@@ -8556,6 +8867,9 @@
         </w:tc>
       </w:tr>
       <w:tr>
+        <w:trPr>
+          <w:cantSplit/>
+        </w:trPr>
         <w:tc>
           <w:tcPr>
             <w:tcW w:type="dxa" w:w="3326"/>
@@ -8759,6 +9073,10 @@
         <w:gridCol w:w="9978"/>
       </w:tblGrid>
       <w:tr>
+        <w:trPr>
+          <w:cantSplit/>
+          <w:tblHeader w:val="true"/>
+        </w:trPr>
         <w:tc>
           <w:tcPr>
             <w:tcW w:type="dxa" w:w="9978"/>
@@ -8823,6 +9141,10 @@
         <w:gridCol w:w="3326"/>
       </w:tblGrid>
       <w:tr>
+        <w:trPr>
+          <w:cantSplit/>
+          <w:tblHeader w:val="true"/>
+        </w:trPr>
         <w:tc>
           <w:tcPr>
             <w:tcW w:type="dxa" w:w="1871"/>
@@ -8912,6 +9234,9 @@
         </w:tc>
       </w:tr>
       <w:tr>
+        <w:trPr>
+          <w:cantSplit/>
+        </w:trPr>
         <w:tc>
           <w:tcPr>
             <w:tcW w:type="dxa" w:w="1871"/>
@@ -8995,6 +9320,9 @@
         </w:tc>
       </w:tr>
       <w:tr>
+        <w:trPr>
+          <w:cantSplit/>
+        </w:trPr>
         <w:tc>
           <w:tcPr>
             <w:tcW w:type="dxa" w:w="1871"/>
@@ -9078,6 +9406,9 @@
         </w:tc>
       </w:tr>
       <w:tr>
+        <w:trPr>
+          <w:cantSplit/>
+        </w:trPr>
         <w:tc>
           <w:tcPr>
             <w:tcW w:type="dxa" w:w="1871"/>
@@ -9161,6 +9492,9 @@
         </w:tc>
       </w:tr>
       <w:tr>
+        <w:trPr>
+          <w:cantSplit/>
+        </w:trPr>
         <w:tc>
           <w:tcPr>
             <w:tcW w:type="dxa" w:w="1871"/>
@@ -9244,6 +9578,9 @@
         </w:tc>
       </w:tr>
       <w:tr>
+        <w:trPr>
+          <w:cantSplit/>
+        </w:trPr>
         <w:tc>
           <w:tcPr>
             <w:tcW w:type="dxa" w:w="1871"/>
@@ -9327,6 +9664,9 @@
         </w:tc>
       </w:tr>
       <w:tr>
+        <w:trPr>
+          <w:cantSplit/>
+        </w:trPr>
         <w:tc>
           <w:tcPr>
             <w:tcW w:type="dxa" w:w="1871"/>
@@ -9410,6 +9750,9 @@
         </w:tc>
       </w:tr>
       <w:tr>
+        <w:trPr>
+          <w:cantSplit/>
+        </w:trPr>
         <w:tc>
           <w:tcPr>
             <w:tcW w:type="dxa" w:w="1871"/>
@@ -9493,6 +9836,9 @@
         </w:tc>
       </w:tr>
       <w:tr>
+        <w:trPr>
+          <w:cantSplit/>
+        </w:trPr>
         <w:tc>
           <w:tcPr>
             <w:tcW w:type="dxa" w:w="1871"/>
@@ -9576,6 +9922,9 @@
         </w:tc>
       </w:tr>
       <w:tr>
+        <w:trPr>
+          <w:cantSplit/>
+        </w:trPr>
         <w:tc>
           <w:tcPr>
             <w:tcW w:type="dxa" w:w="1871"/>
@@ -9659,6 +10008,9 @@
         </w:tc>
       </w:tr>
       <w:tr>
+        <w:trPr>
+          <w:cantSplit/>
+        </w:trPr>
         <w:tc>
           <w:tcPr>
             <w:tcW w:type="dxa" w:w="1871"/>
@@ -9742,6 +10094,9 @@
         </w:tc>
       </w:tr>
       <w:tr>
+        <w:trPr>
+          <w:cantSplit/>
+        </w:trPr>
         <w:tc>
           <w:tcPr>
             <w:tcW w:type="dxa" w:w="1871"/>
@@ -9825,6 +10180,9 @@
         </w:tc>
       </w:tr>
       <w:tr>
+        <w:trPr>
+          <w:cantSplit/>
+        </w:trPr>
         <w:tc>
           <w:tcPr>
             <w:tcW w:type="dxa" w:w="1871"/>
@@ -9908,6 +10266,9 @@
         </w:tc>
       </w:tr>
       <w:tr>
+        <w:trPr>
+          <w:cantSplit/>
+        </w:trPr>
         <w:tc>
           <w:tcPr>
             <w:tcW w:type="dxa" w:w="1871"/>
@@ -9991,6 +10352,9 @@
         </w:tc>
       </w:tr>
       <w:tr>
+        <w:trPr>
+          <w:cantSplit/>
+        </w:trPr>
         <w:tc>
           <w:tcPr>
             <w:tcW w:type="dxa" w:w="1871"/>
@@ -10074,6 +10438,9 @@
         </w:tc>
       </w:tr>
       <w:tr>
+        <w:trPr>
+          <w:cantSplit/>
+        </w:trPr>
         <w:tc>
           <w:tcPr>
             <w:tcW w:type="dxa" w:w="1871"/>
@@ -10193,6 +10560,10 @@
         <w:gridCol w:w="9978"/>
       </w:tblGrid>
       <w:tr>
+        <w:trPr>
+          <w:cantSplit/>
+          <w:tblHeader w:val="true"/>
+        </w:trPr>
         <w:tc>
           <w:tcPr>
             <w:tcW w:type="dxa" w:w="9978"/>
@@ -10265,6 +10636,10 @@
         <w:gridCol w:w="4989"/>
       </w:tblGrid>
       <w:tr>
+        <w:trPr>
+          <w:cantSplit/>
+          <w:tblHeader w:val="true"/>
+        </w:trPr>
         <w:tc>
           <w:tcPr>
             <w:tcW w:type="dxa" w:w="4989"/>
@@ -10325,6 +10700,9 @@
         </w:tc>
       </w:tr>
       <w:tr>
+        <w:trPr>
+          <w:cantSplit/>
+        </w:trPr>
         <w:tc>
           <w:tcPr>
             <w:tcW w:type="dxa" w:w="4989"/>
@@ -10381,6 +10759,9 @@
         </w:tc>
       </w:tr>
       <w:tr>
+        <w:trPr>
+          <w:cantSplit/>
+        </w:trPr>
         <w:tc>
           <w:tcPr>
             <w:tcW w:type="dxa" w:w="4989"/>
@@ -10437,6 +10818,9 @@
         </w:tc>
       </w:tr>
       <w:tr>
+        <w:trPr>
+          <w:cantSplit/>
+        </w:trPr>
         <w:tc>
           <w:tcPr>
             <w:tcW w:type="dxa" w:w="4989"/>
@@ -10493,6 +10877,9 @@
         </w:tc>
       </w:tr>
       <w:tr>
+        <w:trPr>
+          <w:cantSplit/>
+        </w:trPr>
         <w:tc>
           <w:tcPr>
             <w:tcW w:type="dxa" w:w="4989"/>
@@ -10576,6 +10963,10 @@
         <w:gridCol w:w="3326"/>
       </w:tblGrid>
       <w:tr>
+        <w:trPr>
+          <w:cantSplit/>
+          <w:tblHeader w:val="true"/>
+        </w:trPr>
         <w:tc>
           <w:tcPr>
             <w:tcW w:type="dxa" w:w="1814"/>
@@ -10665,6 +11056,9 @@
         </w:tc>
       </w:tr>
       <w:tr>
+        <w:trPr>
+          <w:cantSplit/>
+        </w:trPr>
         <w:tc>
           <w:tcPr>
             <w:tcW w:type="dxa" w:w="1814"/>
@@ -10748,6 +11142,9 @@
         </w:tc>
       </w:tr>
       <w:tr>
+        <w:trPr>
+          <w:cantSplit/>
+        </w:trPr>
         <w:tc>
           <w:tcPr>
             <w:tcW w:type="dxa" w:w="1814"/>
@@ -10831,6 +11228,9 @@
         </w:tc>
       </w:tr>
       <w:tr>
+        <w:trPr>
+          <w:cantSplit/>
+        </w:trPr>
         <w:tc>
           <w:tcPr>
             <w:tcW w:type="dxa" w:w="1814"/>
@@ -10914,6 +11314,9 @@
         </w:tc>
       </w:tr>
       <w:tr>
+        <w:trPr>
+          <w:cantSplit/>
+        </w:trPr>
         <w:tc>
           <w:tcPr>
             <w:tcW w:type="dxa" w:w="1814"/>
@@ -10997,6 +11400,9 @@
         </w:tc>
       </w:tr>
       <w:tr>
+        <w:trPr>
+          <w:cantSplit/>
+        </w:trPr>
         <w:tc>
           <w:tcPr>
             <w:tcW w:type="dxa" w:w="1814"/>
@@ -11080,6 +11486,9 @@
         </w:tc>
       </w:tr>
       <w:tr>
+        <w:trPr>
+          <w:cantSplit/>
+        </w:trPr>
         <w:tc>
           <w:tcPr>
             <w:tcW w:type="dxa" w:w="1814"/>
@@ -11163,6 +11572,9 @@
         </w:tc>
       </w:tr>
       <w:tr>
+        <w:trPr>
+          <w:cantSplit/>
+        </w:trPr>
         <w:tc>
           <w:tcPr>
             <w:tcW w:type="dxa" w:w="1814"/>
@@ -11246,6 +11658,9 @@
         </w:tc>
       </w:tr>
       <w:tr>
+        <w:trPr>
+          <w:cantSplit/>
+        </w:trPr>
         <w:tc>
           <w:tcPr>
             <w:tcW w:type="dxa" w:w="1814"/>
@@ -11329,6 +11744,9 @@
         </w:tc>
       </w:tr>
       <w:tr>
+        <w:trPr>
+          <w:cantSplit/>
+        </w:trPr>
         <w:tc>
           <w:tcPr>
             <w:tcW w:type="dxa" w:w="1814"/>
@@ -11412,6 +11830,9 @@
         </w:tc>
       </w:tr>
       <w:tr>
+        <w:trPr>
+          <w:cantSplit/>
+        </w:trPr>
         <w:tc>
           <w:tcPr>
             <w:tcW w:type="dxa" w:w="1814"/>
@@ -11495,6 +11916,9 @@
         </w:tc>
       </w:tr>
       <w:tr>
+        <w:trPr>
+          <w:cantSplit/>
+        </w:trPr>
         <w:tc>
           <w:tcPr>
             <w:tcW w:type="dxa" w:w="1814"/>
@@ -11578,6 +12002,9 @@
         </w:tc>
       </w:tr>
       <w:tr>
+        <w:trPr>
+          <w:cantSplit/>
+        </w:trPr>
         <w:tc>
           <w:tcPr>
             <w:tcW w:type="dxa" w:w="1814"/>
@@ -11661,6 +12088,9 @@
         </w:tc>
       </w:tr>
       <w:tr>
+        <w:trPr>
+          <w:cantSplit/>
+        </w:trPr>
         <w:tc>
           <w:tcPr>
             <w:tcW w:type="dxa" w:w="1814"/>
@@ -11864,6 +12294,10 @@
         <w:gridCol w:w="9978"/>
       </w:tblGrid>
       <w:tr>
+        <w:trPr>
+          <w:cantSplit/>
+          <w:tblHeader w:val="true"/>
+        </w:trPr>
         <w:tc>
           <w:tcPr>
             <w:tcW w:type="dxa" w:w="9978"/>
@@ -12074,6 +12508,10 @@
         <w:gridCol w:w="9978"/>
       </w:tblGrid>
       <w:tr>
+        <w:trPr>
+          <w:cantSplit/>
+          <w:tblHeader w:val="true"/>
+        </w:trPr>
         <w:tc>
           <w:tcPr>
             <w:tcW w:type="dxa" w:w="9978"/>
@@ -12411,6 +12849,10 @@
         <w:gridCol w:w="9978"/>
       </w:tblGrid>
       <w:tr>
+        <w:trPr>
+          <w:cantSplit/>
+          <w:tblHeader w:val="true"/>
+        </w:trPr>
         <w:tc>
           <w:tcPr>
             <w:tcW w:type="dxa" w:w="9978"/>
@@ -12510,7 +12952,7 @@
         <w:rPr>
           <w:rFonts w:ascii="Liberation Sans" w:hAnsi="Liberation Sans"/>
         </w:rPr>
-        <w:t>The Client Portal page is currently a public presentation of what an organised client experience can contain. It is not a real authenticated customer account system yet.</w:t>
+        <w:t>The Client Portal is now a secure, authenticated Supabase-backed portal. Access is limited to authorized users and data is protected by Row Level Security. The public site does not offer open account registration.</w:t>
       </w:r>
     </w:p>
     <w:tbl>
@@ -12525,6 +12967,10 @@
         <w:gridCol w:w="4989"/>
       </w:tblGrid>
       <w:tr>
+        <w:trPr>
+          <w:cantSplit/>
+          <w:tblHeader w:val="true"/>
+        </w:trPr>
         <w:tc>
           <w:tcPr>
             <w:tcW w:type="dxa" w:w="4989"/>
@@ -12550,7 +12996,7 @@
                 <w:color w:val="FFFFFF"/>
                 <w:sz w:val="18"/>
               </w:rPr>
-              <w:t>Shown publicly now</w:t>
+              <w:t>Portal area</w:t>
             </w:r>
           </w:p>
         </w:tc>
@@ -12579,12 +13025,15 @@
                 <w:color w:val="FFFFFF"/>
                 <w:sz w:val="18"/>
               </w:rPr>
-              <w:t>What a real portal would still need</w:t>
+              <w:t>Current status</w:t>
             </w:r>
           </w:p>
         </w:tc>
       </w:tr>
       <w:tr>
+        <w:trPr>
+          <w:cantSplit/>
+        </w:trPr>
         <w:tc>
           <w:tcPr>
             <w:tcW w:type="dxa" w:w="4989"/>
@@ -12608,7 +13057,7 @@
                 <w:rFonts w:ascii="Liberation Sans" w:hAnsi="Liberation Sans"/>
                 <w:sz w:val="17"/>
               </w:rPr>
-              <w:t>Appointments</w:t>
+              <w:t>Authentication and account access</w:t>
             </w:r>
           </w:p>
         </w:tc>
@@ -12635,12 +13084,15 @@
                 <w:rFonts w:ascii="Liberation Sans" w:hAnsi="Liberation Sans"/>
                 <w:sz w:val="17"/>
               </w:rPr>
-              <w:t>Authentication and user-specific appointment data</w:t>
+              <w:t>Live through Supabase Auth; accounts are administered, not openly self-registered.</w:t>
             </w:r>
           </w:p>
         </w:tc>
       </w:tr>
       <w:tr>
+        <w:trPr>
+          <w:cantSplit/>
+        </w:trPr>
         <w:tc>
           <w:tcPr>
             <w:tcW w:type="dxa" w:w="4989"/>
@@ -12664,7 +13116,7 @@
                 <w:rFonts w:ascii="Liberation Sans" w:hAnsi="Liberation Sans"/>
                 <w:sz w:val="17"/>
               </w:rPr>
-              <w:t>Documents</w:t>
+              <w:t>Account-specific records</w:t>
             </w:r>
           </w:p>
         </w:tc>
@@ -12691,12 +13143,15 @@
                 <w:rFonts w:ascii="Liberation Sans" w:hAnsi="Liberation Sans"/>
                 <w:sz w:val="17"/>
               </w:rPr>
-              <w:t>Secure private storage and permission controls</w:t>
+              <w:t>Protected using role and account membership rules.</w:t>
             </w:r>
           </w:p>
         </w:tc>
       </w:tr>
       <w:tr>
+        <w:trPr>
+          <w:cantSplit/>
+        </w:trPr>
         <w:tc>
           <w:tcPr>
             <w:tcW w:type="dxa" w:w="4989"/>
@@ -12720,7 +13175,7 @@
                 <w:rFonts w:ascii="Liberation Sans" w:hAnsi="Liberation Sans"/>
                 <w:sz w:val="17"/>
               </w:rPr>
-              <w:t>Training</w:t>
+              <w:t>Testimonials moderation</w:t>
             </w:r>
           </w:p>
         </w:tc>
@@ -12747,12 +13202,15 @@
                 <w:rFonts w:ascii="Liberation Sans" w:hAnsi="Liberation Sans"/>
                 <w:sz w:val="17"/>
               </w:rPr>
-              <w:t>User-specific enrolment and protected materials</w:t>
+              <w:t>Admin-only review controls are provided in the secure portal.</w:t>
             </w:r>
           </w:p>
         </w:tc>
       </w:tr>
       <w:tr>
+        <w:trPr>
+          <w:cantSplit/>
+        </w:trPr>
         <w:tc>
           <w:tcPr>
             <w:tcW w:type="dxa" w:w="4989"/>
@@ -12776,7 +13234,7 @@
                 <w:rFonts w:ascii="Liberation Sans" w:hAnsi="Liberation Sans"/>
                 <w:sz w:val="17"/>
               </w:rPr>
-              <w:t>Payments &amp; Updates</w:t>
+              <w:t>Online checkout and payments</w:t>
             </w:r>
           </w:p>
         </w:tc>
@@ -12803,7 +13261,7 @@
                 <w:rFonts w:ascii="Liberation Sans" w:hAnsi="Liberation Sans"/>
                 <w:sz w:val="17"/>
               </w:rPr>
-              <w:t>Payment integration, records and private account history</w:t>
+              <w:t>Not implemented; do not advertise as available.</w:t>
             </w:r>
           </w:p>
         </w:tc>
@@ -12825,6 +13283,10 @@
         <w:gridCol w:w="9978"/>
       </w:tblGrid>
       <w:tr>
+        <w:trPr>
+          <w:cantSplit/>
+          <w:tblHeader w:val="true"/>
+        </w:trPr>
         <w:tc>
           <w:tcPr>
             <w:tcW w:type="dxa" w:w="9978"/>
@@ -12856,7 +13318,7 @@
                 <w:rFonts w:ascii="Liberation Sans" w:hAnsi="Liberation Sans"/>
                 <w:color w:val="1A1A1A"/>
               </w:rPr>
-              <w:t>Do not try to create “password protection” by hiding text in JavaScript or placing client documents in public assets. A real portal requires proper authentication, private storage and access control.</w:t>
+              <w:t>Do not put passwords, service-role keys, private API keys or client records in browser-delivered files or public assets. Preserve Supabase Auth and Row Level Security; do not create a fake client-side login.</w:t>
             </w:r>
           </w:p>
         </w:tc>
@@ -12900,6 +13362,10 @@
         <w:gridCol w:w="3326"/>
       </w:tblGrid>
       <w:tr>
+        <w:trPr>
+          <w:cantSplit/>
+          <w:tblHeader w:val="true"/>
+        </w:trPr>
         <w:tc>
           <w:tcPr>
             <w:tcW w:type="dxa" w:w="3326"/>
@@ -12989,6 +13455,9 @@
         </w:tc>
       </w:tr>
       <w:tr>
+        <w:trPr>
+          <w:cantSplit/>
+        </w:trPr>
         <w:tc>
           <w:tcPr>
             <w:tcW w:type="dxa" w:w="3326"/>
@@ -13072,6 +13541,9 @@
         </w:tc>
       </w:tr>
       <w:tr>
+        <w:trPr>
+          <w:cantSplit/>
+        </w:trPr>
         <w:tc>
           <w:tcPr>
             <w:tcW w:type="dxa" w:w="3326"/>
@@ -13155,6 +13627,9 @@
         </w:tc>
       </w:tr>
       <w:tr>
+        <w:trPr>
+          <w:cantSplit/>
+        </w:trPr>
         <w:tc>
           <w:tcPr>
             <w:tcW w:type="dxa" w:w="3326"/>
@@ -13238,6 +13713,9 @@
         </w:tc>
       </w:tr>
       <w:tr>
+        <w:trPr>
+          <w:cantSplit/>
+        </w:trPr>
         <w:tc>
           <w:tcPr>
             <w:tcW w:type="dxa" w:w="3326"/>
@@ -13429,6 +13907,10 @@
         <w:gridCol w:w="9978"/>
       </w:tblGrid>
       <w:tr>
+        <w:trPr>
+          <w:cantSplit/>
+          <w:tblHeader w:val="true"/>
+        </w:trPr>
         <w:tc>
           <w:tcPr>
             <w:tcW w:type="dxa" w:w="9978"/>
@@ -13512,6 +13994,10 @@
         <w:gridCol w:w="4989"/>
       </w:tblGrid>
       <w:tr>
+        <w:trPr>
+          <w:cantSplit/>
+          <w:tblHeader w:val="true"/>
+        </w:trPr>
         <w:tc>
           <w:tcPr>
             <w:tcW w:type="dxa" w:w="4989"/>
@@ -13572,6 +14058,9 @@
         </w:tc>
       </w:tr>
       <w:tr>
+        <w:trPr>
+          <w:cantSplit/>
+        </w:trPr>
         <w:tc>
           <w:tcPr>
             <w:tcW w:type="dxa" w:w="4989"/>
@@ -13628,6 +14117,9 @@
         </w:tc>
       </w:tr>
       <w:tr>
+        <w:trPr>
+          <w:cantSplit/>
+        </w:trPr>
         <w:tc>
           <w:tcPr>
             <w:tcW w:type="dxa" w:w="4989"/>
@@ -13684,6 +14176,9 @@
         </w:tc>
       </w:tr>
       <w:tr>
+        <w:trPr>
+          <w:cantSplit/>
+        </w:trPr>
         <w:tc>
           <w:tcPr>
             <w:tcW w:type="dxa" w:w="4989"/>
@@ -13740,6 +14235,9 @@
         </w:tc>
       </w:tr>
       <w:tr>
+        <w:trPr>
+          <w:cantSplit/>
+        </w:trPr>
         <w:tc>
           <w:tcPr>
             <w:tcW w:type="dxa" w:w="4989"/>
@@ -14012,6 +14510,10 @@
         <w:gridCol w:w="9978"/>
       </w:tblGrid>
       <w:tr>
+        <w:trPr>
+          <w:cantSplit/>
+          <w:tblHeader w:val="true"/>
+        </w:trPr>
         <w:tc>
           <w:tcPr>
             <w:tcW w:type="dxa" w:w="9978"/>
@@ -14068,6 +14570,10 @@
         <w:gridCol w:w="9978"/>
       </w:tblGrid>
       <w:tr>
+        <w:trPr>
+          <w:cantSplit/>
+          <w:tblHeader w:val="true"/>
+        </w:trPr>
         <w:tc>
           <w:tcPr>
             <w:tcW w:type="dxa" w:w="9978"/>
@@ -14512,6 +15018,10 @@
         <w:gridCol w:w="9978"/>
       </w:tblGrid>
       <w:tr>
+        <w:trPr>
+          <w:cantSplit/>
+          <w:tblHeader w:val="true"/>
+        </w:trPr>
         <w:tc>
           <w:tcPr>
             <w:tcW w:type="dxa" w:w="9978"/>
@@ -15059,6 +15569,10 @@
         <w:gridCol w:w="9978"/>
       </w:tblGrid>
       <w:tr>
+        <w:trPr>
+          <w:cantSplit/>
+          <w:tblHeader w:val="true"/>
+        </w:trPr>
         <w:tc>
           <w:tcPr>
             <w:tcW w:type="dxa" w:w="9978"/>
@@ -15621,6 +16135,10 @@
         <w:gridCol w:w="9978"/>
       </w:tblGrid>
       <w:tr>
+        <w:trPr>
+          <w:cantSplit/>
+          <w:tblHeader w:val="true"/>
+        </w:trPr>
         <w:tc>
           <w:tcPr>
             <w:tcW w:type="dxa" w:w="9978"/>
@@ -16106,6 +16624,10 @@
         <w:gridCol w:w="3326"/>
       </w:tblGrid>
       <w:tr>
+        <w:trPr>
+          <w:cantSplit/>
+          <w:tblHeader w:val="true"/>
+        </w:trPr>
         <w:tc>
           <w:tcPr>
             <w:tcW w:type="dxa" w:w="2608"/>
@@ -16195,6 +16717,9 @@
         </w:tc>
       </w:tr>
       <w:tr>
+        <w:trPr>
+          <w:cantSplit/>
+        </w:trPr>
         <w:tc>
           <w:tcPr>
             <w:tcW w:type="dxa" w:w="2608"/>
@@ -16278,6 +16803,9 @@
         </w:tc>
       </w:tr>
       <w:tr>
+        <w:trPr>
+          <w:cantSplit/>
+        </w:trPr>
         <w:tc>
           <w:tcPr>
             <w:tcW w:type="dxa" w:w="2608"/>
@@ -16361,6 +16889,9 @@
         </w:tc>
       </w:tr>
       <w:tr>
+        <w:trPr>
+          <w:cantSplit/>
+        </w:trPr>
         <w:tc>
           <w:tcPr>
             <w:tcW w:type="dxa" w:w="2608"/>
@@ -16444,6 +16975,9 @@
         </w:tc>
       </w:tr>
       <w:tr>
+        <w:trPr>
+          <w:cantSplit/>
+        </w:trPr>
         <w:tc>
           <w:tcPr>
             <w:tcW w:type="dxa" w:w="2608"/>
@@ -16527,6 +17061,9 @@
         </w:tc>
       </w:tr>
       <w:tr>
+        <w:trPr>
+          <w:cantSplit/>
+        </w:trPr>
         <w:tc>
           <w:tcPr>
             <w:tcW w:type="dxa" w:w="2608"/>
@@ -16610,6 +17147,9 @@
         </w:tc>
       </w:tr>
       <w:tr>
+        <w:trPr>
+          <w:cantSplit/>
+        </w:trPr>
         <w:tc>
           <w:tcPr>
             <w:tcW w:type="dxa" w:w="2608"/>
@@ -16693,6 +17233,9 @@
         </w:tc>
       </w:tr>
       <w:tr>
+        <w:trPr>
+          <w:cantSplit/>
+        </w:trPr>
         <w:tc>
           <w:tcPr>
             <w:tcW w:type="dxa" w:w="2608"/>
@@ -16776,6 +17319,9 @@
         </w:tc>
       </w:tr>
       <w:tr>
+        <w:trPr>
+          <w:cantSplit/>
+        </w:trPr>
         <w:tc>
           <w:tcPr>
             <w:tcW w:type="dxa" w:w="2608"/>
@@ -16859,6 +17405,9 @@
         </w:tc>
       </w:tr>
       <w:tr>
+        <w:trPr>
+          <w:cantSplit/>
+        </w:trPr>
         <w:tc>
           <w:tcPr>
             <w:tcW w:type="dxa" w:w="2608"/>
@@ -16909,7 +17458,7 @@
                 <w:rFonts w:ascii="Liberation Sans" w:hAnsi="Liberation Sans"/>
                 <w:sz w:val="15"/>
               </w:rPr>
-              <w:t>COLLECTION READY</w:t>
+              <w:t>LIVE — MODERATED</w:t>
             </w:r>
           </w:p>
         </w:tc>
@@ -16936,12 +17485,15 @@
                 <w:rFonts w:ascii="Liberation Sans" w:hAnsi="Liberation Sans"/>
                 <w:sz w:val="15"/>
               </w:rPr>
-              <w:t>No invented testimonials; email submission/permission path exists.</w:t>
+              <w:t>Portfolio form submits to Supabase; public page shows only approved submissions with consent.</w:t>
             </w:r>
           </w:p>
         </w:tc>
       </w:tr>
       <w:tr>
+        <w:trPr>
+          <w:cantSplit/>
+        </w:trPr>
         <w:tc>
           <w:tcPr>
             <w:tcW w:type="dxa" w:w="2608"/>
@@ -17025,6 +17577,9 @@
         </w:tc>
       </w:tr>
       <w:tr>
+        <w:trPr>
+          <w:cantSplit/>
+        </w:trPr>
         <w:tc>
           <w:tcPr>
             <w:tcW w:type="dxa" w:w="2608"/>
@@ -17108,6 +17663,9 @@
         </w:tc>
       </w:tr>
       <w:tr>
+        <w:trPr>
+          <w:cantSplit/>
+        </w:trPr>
         <w:tc>
           <w:tcPr>
             <w:tcW w:type="dxa" w:w="2608"/>
@@ -17131,7 +17689,7 @@
                 <w:rFonts w:ascii="Liberation Sans" w:hAnsi="Liberation Sans"/>
                 <w:sz w:val="15"/>
               </w:rPr>
-              <w:t>Client Portal</w:t>
+              <w:t>Client / admin portal</w:t>
             </w:r>
           </w:p>
         </w:tc>
@@ -17158,7 +17716,7 @@
                 <w:rFonts w:ascii="Liberation Sans" w:hAnsi="Liberation Sans"/>
                 <w:sz w:val="15"/>
               </w:rPr>
-              <w:t>FRONT-END CONCEPT</w:t>
+              <w:t>LIVE — AUTHENTICATED</w:t>
             </w:r>
           </w:p>
         </w:tc>
@@ -17185,12 +17743,15 @@
                 <w:rFonts w:ascii="Liberation Sans" w:hAnsi="Liberation Sans"/>
                 <w:sz w:val="15"/>
               </w:rPr>
-              <w:t>No authentication/private backend yet.</w:t>
+              <w:t>Supabase Auth, role/account access and Row Level Security; testimonial moderation is admin-only.</w:t>
             </w:r>
           </w:p>
         </w:tc>
       </w:tr>
       <w:tr>
+        <w:trPr>
+          <w:cantSplit/>
+        </w:trPr>
         <w:tc>
           <w:tcPr>
             <w:tcW w:type="dxa" w:w="2608"/>
@@ -17214,7 +17775,7 @@
                 <w:rFonts w:ascii="Liberation Sans" w:hAnsi="Liberation Sans"/>
                 <w:sz w:val="15"/>
               </w:rPr>
-              <w:t>Online payments</w:t>
+              <w:t>Online checkout/payments</w:t>
             </w:r>
           </w:p>
         </w:tc>
@@ -17268,12 +17829,15 @@
                 <w:rFonts w:ascii="Liberation Sans" w:hAnsi="Liberation Sans"/>
                 <w:sz w:val="15"/>
               </w:rPr>
-              <w:t>Requires secure provider/backend approach.</w:t>
+              <w:t>Store is enquiry-led; no online payment processor.</w:t>
             </w:r>
           </w:p>
         </w:tc>
       </w:tr>
       <w:tr>
+        <w:trPr>
+          <w:cantSplit/>
+        </w:trPr>
         <w:tc>
           <w:tcPr>
             <w:tcW w:type="dxa" w:w="2608"/>
@@ -17357,6 +17921,9 @@
         </w:tc>
       </w:tr>
       <w:tr>
+        <w:trPr>
+          <w:cantSplit/>
+        </w:trPr>
         <w:tc>
           <w:tcPr>
             <w:tcW w:type="dxa" w:w="2608"/>
@@ -17440,6 +18007,9 @@
         </w:tc>
       </w:tr>
       <w:tr>
+        <w:trPr>
+          <w:cantSplit/>
+        </w:trPr>
         <w:tc>
           <w:tcPr>
             <w:tcW w:type="dxa" w:w="2608"/>
@@ -17562,6 +18132,10 @@
         <w:gridCol w:w="2494"/>
       </w:tblGrid>
       <w:tr>
+        <w:trPr>
+          <w:cantSplit/>
+          <w:tblHeader w:val="true"/>
+        </w:trPr>
         <w:tc>
           <w:tcPr>
             <w:tcW w:type="dxa" w:w="1701"/>
@@ -17680,6 +18254,9 @@
         </w:tc>
       </w:tr>
       <w:tr>
+        <w:trPr>
+          <w:cantSplit/>
+        </w:trPr>
         <w:tc>
           <w:tcPr>
             <w:tcW w:type="dxa" w:w="1701"/>
@@ -17790,6 +18367,9 @@
         </w:tc>
       </w:tr>
       <w:tr>
+        <w:trPr>
+          <w:cantSplit/>
+        </w:trPr>
         <w:tc>
           <w:tcPr>
             <w:tcW w:type="dxa" w:w="1701"/>
@@ -17896,6 +18476,9 @@
         </w:tc>
       </w:tr>
       <w:tr>
+        <w:trPr>
+          <w:cantSplit/>
+        </w:trPr>
         <w:tc>
           <w:tcPr>
             <w:tcW w:type="dxa" w:w="1701"/>
@@ -18002,6 +18585,9 @@
         </w:tc>
       </w:tr>
       <w:tr>
+        <w:trPr>
+          <w:cantSplit/>
+        </w:trPr>
         <w:tc>
           <w:tcPr>
             <w:tcW w:type="dxa" w:w="1701"/>
@@ -18108,6 +18694,9 @@
         </w:tc>
       </w:tr>
       <w:tr>
+        <w:trPr>
+          <w:cantSplit/>
+        </w:trPr>
         <w:tc>
           <w:tcPr>
             <w:tcW w:type="dxa" w:w="1701"/>
@@ -18214,6 +18803,9 @@
         </w:tc>
       </w:tr>
       <w:tr>
+        <w:trPr>
+          <w:cantSplit/>
+        </w:trPr>
         <w:tc>
           <w:tcPr>
             <w:tcW w:type="dxa" w:w="1701"/>
@@ -18449,6 +19041,10 @@
         <w:gridCol w:w="9978"/>
       </w:tblGrid>
       <w:tr>
+        <w:trPr>
+          <w:cantSplit/>
+          <w:tblHeader w:val="true"/>
+        </w:trPr>
         <w:tc>
           <w:tcPr>
             <w:tcW w:type="dxa" w:w="9978"/>
@@ -18490,6 +19086,1644 @@
       <w:pPr>
         <w:spacing w:after="0"/>
       </w:pPr>
+    </w:p>
+    <w:p>
+      <w:pPr>
+        <w:pStyle w:val="Heading1"/>
+        <w:keepNext/>
+      </w:pPr>
+      <w:r>
+        <w:t>16. Client Reviews and the Secure Admin Portal</w:t>
+      </w:r>
+    </w:p>
+    <w:p>
+      <w:pPr>
+        <w:spacing w:after="140" w:line="276" w:lineRule="auto"/>
+      </w:pPr>
+      <w:r>
+        <w:rPr>
+          <w:rFonts w:ascii="Liberation Sans" w:hAnsi="Liberation Sans"/>
+        </w:rPr>
+        <w:t>The Portfolio page includes a real client-feedback form. Submissions go to Elyra Suite for review. The public page displays only submissions that have been approved and have publication consent. The form is not a promise of instant publication.</w:t>
+      </w:r>
+    </w:p>
+    <w:tbl>
+      <w:tblPr>
+        <w:tblW w:type="auto" w:w="0"/>
+        <w:jc w:val="center"/>
+        <w:tblLayout w:type="fixed"/>
+        <w:tblLook w:firstColumn="1" w:firstRow="1" w:lastColumn="0" w:lastRow="0" w:noHBand="0" w:noVBand="1" w:val="04A0"/>
+      </w:tblPr>
+      <w:tblGrid>
+        <w:gridCol w:w="3326"/>
+        <w:gridCol w:w="3326"/>
+        <w:gridCol w:w="3326"/>
+      </w:tblGrid>
+      <w:tr>
+        <w:trPr>
+          <w:cantSplit/>
+          <w:tblHeader w:val="true"/>
+        </w:trPr>
+        <w:tc>
+          <w:tcPr>
+            <w:tcW w:type="dxa" w:w="2041"/>
+            <w:shd w:fill="4A235A"/>
+            <w:tcBorders>
+              <w:top w:val="single" w:sz="4" w:space="0" w:color="D8CCD5"/>
+              <w:left w:val="single" w:sz="4" w:space="0" w:color="D8CCD5"/>
+              <w:bottom w:val="single" w:sz="4" w:space="0" w:color="D8CCD5"/>
+              <w:right w:val="single" w:sz="4" w:space="0" w:color="D8CCD5"/>
+              <w:insideH w:val="single" w:sz="4" w:space="0" w:color="D8CCD5"/>
+              <w:insideV w:val="single" w:sz="4" w:space="0" w:color="D8CCD5"/>
+            </w:tcBorders>
+            <w:vAlign w:val="center"/>
+          </w:tcPr>
+          <w:p>
+            <w:pPr>
+              <w:jc w:val="left"/>
+            </w:pPr>
+            <w:r>
+              <w:rPr>
+                <w:rFonts w:ascii="Liberation Sans" w:hAnsi="Liberation Sans"/>
+                <w:b/>
+                <w:color w:val="FFFFFF"/>
+                <w:sz w:val="17"/>
+              </w:rPr>
+              <w:t>Area</w:t>
+            </w:r>
+          </w:p>
+        </w:tc>
+        <w:tc>
+          <w:tcPr>
+            <w:tcW w:type="dxa" w:w="3118"/>
+            <w:shd w:fill="4A235A"/>
+            <w:tcBorders>
+              <w:top w:val="single" w:sz="4" w:space="0" w:color="D8CCD5"/>
+              <w:left w:val="single" w:sz="4" w:space="0" w:color="D8CCD5"/>
+              <w:bottom w:val="single" w:sz="4" w:space="0" w:color="D8CCD5"/>
+              <w:right w:val="single" w:sz="4" w:space="0" w:color="D8CCD5"/>
+              <w:insideH w:val="single" w:sz="4" w:space="0" w:color="D8CCD5"/>
+              <w:insideV w:val="single" w:sz="4" w:space="0" w:color="D8CCD5"/>
+            </w:tcBorders>
+            <w:vAlign w:val="center"/>
+          </w:tcPr>
+          <w:p>
+            <w:pPr>
+              <w:jc w:val="left"/>
+            </w:pPr>
+            <w:r>
+              <w:rPr>
+                <w:rFonts w:ascii="Liberation Sans" w:hAnsi="Liberation Sans"/>
+                <w:b/>
+                <w:color w:val="FFFFFF"/>
+                <w:sz w:val="17"/>
+              </w:rPr>
+              <w:t>Current file / system</w:t>
+            </w:r>
+          </w:p>
+        </w:tc>
+        <w:tc>
+          <w:tcPr>
+            <w:tcW w:type="dxa" w:w="4762"/>
+            <w:shd w:fill="4A235A"/>
+            <w:tcBorders>
+              <w:top w:val="single" w:sz="4" w:space="0" w:color="D8CCD5"/>
+              <w:left w:val="single" w:sz="4" w:space="0" w:color="D8CCD5"/>
+              <w:bottom w:val="single" w:sz="4" w:space="0" w:color="D8CCD5"/>
+              <w:right w:val="single" w:sz="4" w:space="0" w:color="D8CCD5"/>
+              <w:insideH w:val="single" w:sz="4" w:space="0" w:color="D8CCD5"/>
+              <w:insideV w:val="single" w:sz="4" w:space="0" w:color="D8CCD5"/>
+            </w:tcBorders>
+            <w:vAlign w:val="center"/>
+          </w:tcPr>
+          <w:p>
+            <w:pPr>
+              <w:jc w:val="left"/>
+            </w:pPr>
+            <w:r>
+              <w:rPr>
+                <w:rFonts w:ascii="Liberation Sans" w:hAnsi="Liberation Sans"/>
+                <w:b/>
+                <w:color w:val="FFFFFF"/>
+                <w:sz w:val="17"/>
+              </w:rPr>
+              <w:t>Owner guidance</w:t>
+            </w:r>
+          </w:p>
+        </w:tc>
+      </w:tr>
+      <w:tr>
+        <w:trPr>
+          <w:cantSplit/>
+        </w:trPr>
+        <w:tc>
+          <w:tcPr>
+            <w:tcW w:type="dxa" w:w="2041"/>
+            <w:shd w:fill="FFFFFF"/>
+            <w:tcBorders>
+              <w:top w:val="single" w:sz="4" w:space="0" w:color="E3D9E0"/>
+              <w:left w:val="single" w:sz="4" w:space="0" w:color="E3D9E0"/>
+              <w:bottom w:val="single" w:sz="4" w:space="0" w:color="E3D9E0"/>
+              <w:right w:val="single" w:sz="4" w:space="0" w:color="E3D9E0"/>
+              <w:insideH w:val="single" w:sz="4" w:space="0" w:color="E3D9E0"/>
+              <w:insideV w:val="single" w:sz="4" w:space="0" w:color="E3D9E0"/>
+            </w:tcBorders>
+            <w:vAlign w:val="top"/>
+          </w:tcPr>
+          <w:p>
+            <w:pPr>
+              <w:spacing w:after="40"/>
+            </w:pPr>
+            <w:r>
+              <w:rPr>
+                <w:rFonts w:ascii="Liberation Sans" w:hAnsi="Liberation Sans"/>
+                <w:sz w:val="15"/>
+              </w:rPr>
+              <w:t>Portfolio review section</w:t>
+            </w:r>
+          </w:p>
+        </w:tc>
+        <w:tc>
+          <w:tcPr>
+            <w:tcW w:type="dxa" w:w="3118"/>
+            <w:shd w:fill="FFFFFF"/>
+            <w:tcBorders>
+              <w:top w:val="single" w:sz="4" w:space="0" w:color="E3D9E0"/>
+              <w:left w:val="single" w:sz="4" w:space="0" w:color="E3D9E0"/>
+              <w:bottom w:val="single" w:sz="4" w:space="0" w:color="E3D9E0"/>
+              <w:right w:val="single" w:sz="4" w:space="0" w:color="E3D9E0"/>
+              <w:insideH w:val="single" w:sz="4" w:space="0" w:color="E3D9E0"/>
+              <w:insideV w:val="single" w:sz="4" w:space="0" w:color="E3D9E0"/>
+            </w:tcBorders>
+            <w:vAlign w:val="top"/>
+          </w:tcPr>
+          <w:p>
+            <w:pPr>
+              <w:spacing w:after="40"/>
+            </w:pPr>
+            <w:r>
+              <w:rPr>
+                <w:rFonts w:ascii="Liberation Sans" w:hAnsi="Liberation Sans"/>
+                <w:sz w:val="15"/>
+              </w:rPr>
+              <w:t>pages-connect.js</w:t>
+            </w:r>
+          </w:p>
+        </w:tc>
+        <w:tc>
+          <w:tcPr>
+            <w:tcW w:type="dxa" w:w="4762"/>
+            <w:shd w:fill="FFFFFF"/>
+            <w:tcBorders>
+              <w:top w:val="single" w:sz="4" w:space="0" w:color="E3D9E0"/>
+              <w:left w:val="single" w:sz="4" w:space="0" w:color="E3D9E0"/>
+              <w:bottom w:val="single" w:sz="4" w:space="0" w:color="E3D9E0"/>
+              <w:right w:val="single" w:sz="4" w:space="0" w:color="E3D9E0"/>
+              <w:insideH w:val="single" w:sz="4" w:space="0" w:color="E3D9E0"/>
+              <w:insideV w:val="single" w:sz="4" w:space="0" w:color="E3D9E0"/>
+            </w:tcBorders>
+            <w:vAlign w:val="top"/>
+          </w:tcPr>
+          <w:p>
+            <w:pPr>
+              <w:spacing w:after="40"/>
+            </w:pPr>
+            <w:r>
+              <w:rPr>
+                <w:rFonts w:ascii="Liberation Sans" w:hAnsi="Liberation Sans"/>
+                <w:sz w:val="15"/>
+              </w:rPr>
+              <w:t>Contains the Portfolio route, approved feedback display and submission form. Keep it truthful and test it after edits.</w:t>
+            </w:r>
+          </w:p>
+        </w:tc>
+      </w:tr>
+      <w:tr>
+        <w:trPr>
+          <w:cantSplit/>
+        </w:trPr>
+        <w:tc>
+          <w:tcPr>
+            <w:tcW w:type="dxa" w:w="2041"/>
+            <w:shd w:fill="F8F3F6"/>
+            <w:tcBorders>
+              <w:top w:val="single" w:sz="4" w:space="0" w:color="E3D9E0"/>
+              <w:left w:val="single" w:sz="4" w:space="0" w:color="E3D9E0"/>
+              <w:bottom w:val="single" w:sz="4" w:space="0" w:color="E3D9E0"/>
+              <w:right w:val="single" w:sz="4" w:space="0" w:color="E3D9E0"/>
+              <w:insideH w:val="single" w:sz="4" w:space="0" w:color="E3D9E0"/>
+              <w:insideV w:val="single" w:sz="4" w:space="0" w:color="E3D9E0"/>
+            </w:tcBorders>
+            <w:vAlign w:val="top"/>
+          </w:tcPr>
+          <w:p>
+            <w:pPr>
+              <w:spacing w:after="40"/>
+            </w:pPr>
+            <w:r>
+              <w:rPr>
+                <w:rFonts w:ascii="Liberation Sans" w:hAnsi="Liberation Sans"/>
+                <w:sz w:val="15"/>
+              </w:rPr>
+              <w:t>Secure owner portal</w:t>
+            </w:r>
+          </w:p>
+        </w:tc>
+        <w:tc>
+          <w:tcPr>
+            <w:tcW w:type="dxa" w:w="3118"/>
+            <w:shd w:fill="F8F3F6"/>
+            <w:tcBorders>
+              <w:top w:val="single" w:sz="4" w:space="0" w:color="E3D9E0"/>
+              <w:left w:val="single" w:sz="4" w:space="0" w:color="E3D9E0"/>
+              <w:bottom w:val="single" w:sz="4" w:space="0" w:color="E3D9E0"/>
+              <w:right w:val="single" w:sz="4" w:space="0" w:color="E3D9E0"/>
+              <w:insideH w:val="single" w:sz="4" w:space="0" w:color="E3D9E0"/>
+              <w:insideV w:val="single" w:sz="4" w:space="0" w:color="E3D9E0"/>
+            </w:tcBorders>
+            <w:vAlign w:val="top"/>
+          </w:tcPr>
+          <w:p>
+            <w:pPr>
+              <w:spacing w:after="40"/>
+            </w:pPr>
+            <w:r>
+              <w:rPr>
+                <w:rFonts w:ascii="Liberation Sans" w:hAnsi="Liberation Sans"/>
+                <w:sz w:val="15"/>
+              </w:rPr>
+              <w:t>portal-secure.js, loaded by the portal route</w:t>
+            </w:r>
+          </w:p>
+        </w:tc>
+        <w:tc>
+          <w:tcPr>
+            <w:tcW w:type="dxa" w:w="4762"/>
+            <w:shd w:fill="F8F3F6"/>
+            <w:tcBorders>
+              <w:top w:val="single" w:sz="4" w:space="0" w:color="E3D9E0"/>
+              <w:left w:val="single" w:sz="4" w:space="0" w:color="E3D9E0"/>
+              <w:bottom w:val="single" w:sz="4" w:space="0" w:color="E3D9E0"/>
+              <w:right w:val="single" w:sz="4" w:space="0" w:color="E3D9E0"/>
+              <w:insideH w:val="single" w:sz="4" w:space="0" w:color="E3D9E0"/>
+              <w:insideV w:val="single" w:sz="4" w:space="0" w:color="E3D9E0"/>
+            </w:tcBorders>
+            <w:vAlign w:val="top"/>
+          </w:tcPr>
+          <w:p>
+            <w:pPr>
+              <w:spacing w:after="40"/>
+            </w:pPr>
+            <w:r>
+              <w:rPr>
+                <w:rFonts w:ascii="Liberation Sans" w:hAnsi="Liberation Sans"/>
+                <w:sz w:val="15"/>
+              </w:rPr>
+              <w:t>Uses Supabase Auth and role-based access. The Testimonials tab is for the admin role.</w:t>
+            </w:r>
+          </w:p>
+        </w:tc>
+      </w:tr>
+      <w:tr>
+        <w:trPr>
+          <w:cantSplit/>
+        </w:trPr>
+        <w:tc>
+          <w:tcPr>
+            <w:tcW w:type="dxa" w:w="2041"/>
+            <w:shd w:fill="FFFFFF"/>
+            <w:tcBorders>
+              <w:top w:val="single" w:sz="4" w:space="0" w:color="E3D9E0"/>
+              <w:left w:val="single" w:sz="4" w:space="0" w:color="E3D9E0"/>
+              <w:bottom w:val="single" w:sz="4" w:space="0" w:color="E3D9E0"/>
+              <w:right w:val="single" w:sz="4" w:space="0" w:color="E3D9E0"/>
+              <w:insideH w:val="single" w:sz="4" w:space="0" w:color="E3D9E0"/>
+              <w:insideV w:val="single" w:sz="4" w:space="0" w:color="E3D9E0"/>
+            </w:tcBorders>
+            <w:vAlign w:val="top"/>
+          </w:tcPr>
+          <w:p>
+            <w:pPr>
+              <w:spacing w:after="40"/>
+            </w:pPr>
+            <w:r>
+              <w:rPr>
+                <w:rFonts w:ascii="Liberation Sans" w:hAnsi="Liberation Sans"/>
+                <w:sz w:val="15"/>
+              </w:rPr>
+              <w:t>Database moderation rules</w:t>
+            </w:r>
+          </w:p>
+        </w:tc>
+        <w:tc>
+          <w:tcPr>
+            <w:tcW w:type="dxa" w:w="3118"/>
+            <w:shd w:fill="FFFFFF"/>
+            <w:tcBorders>
+              <w:top w:val="single" w:sz="4" w:space="0" w:color="E3D9E0"/>
+              <w:left w:val="single" w:sz="4" w:space="0" w:color="E3D9E0"/>
+              <w:bottom w:val="single" w:sz="4" w:space="0" w:color="E3D9E0"/>
+              <w:right w:val="single" w:sz="4" w:space="0" w:color="E3D9E0"/>
+              <w:insideH w:val="single" w:sz="4" w:space="0" w:color="E3D9E0"/>
+              <w:insideV w:val="single" w:sz="4" w:space="0" w:color="E3D9E0"/>
+            </w:tcBorders>
+            <w:vAlign w:val="top"/>
+          </w:tcPr>
+          <w:p>
+            <w:pPr>
+              <w:spacing w:after="40"/>
+            </w:pPr>
+            <w:r>
+              <w:rPr>
+                <w:rFonts w:ascii="Liberation Sans" w:hAnsi="Liberation Sans"/>
+                <w:sz w:val="15"/>
+              </w:rPr>
+              <w:t>supabase/migrations/20261020170457_create_elyra_testimonial_moderation.sql</w:t>
+            </w:r>
+          </w:p>
+        </w:tc>
+        <w:tc>
+          <w:tcPr>
+            <w:tcW w:type="dxa" w:w="4762"/>
+            <w:shd w:fill="FFFFFF"/>
+            <w:tcBorders>
+              <w:top w:val="single" w:sz="4" w:space="0" w:color="E3D9E0"/>
+              <w:left w:val="single" w:sz="4" w:space="0" w:color="E3D9E0"/>
+              <w:bottom w:val="single" w:sz="4" w:space="0" w:color="E3D9E0"/>
+              <w:right w:val="single" w:sz="4" w:space="0" w:color="E3D9E0"/>
+              <w:insideH w:val="single" w:sz="4" w:space="0" w:color="E3D9E0"/>
+              <w:insideV w:val="single" w:sz="4" w:space="0" w:color="E3D9E0"/>
+            </w:tcBorders>
+            <w:vAlign w:val="top"/>
+          </w:tcPr>
+          <w:p>
+            <w:pPr>
+              <w:spacing w:after="40"/>
+            </w:pPr>
+            <w:r>
+              <w:rPr>
+                <w:rFonts w:ascii="Liberation Sans" w:hAnsi="Liberation Sans"/>
+                <w:sz w:val="15"/>
+              </w:rPr>
+              <w:t>Defines the testimonials data and Row Level Security. Apply backend changes through a reviewed migration; do not hand-edit production data as a workaround.</w:t>
+            </w:r>
+          </w:p>
+        </w:tc>
+      </w:tr>
+      <w:tr>
+        <w:trPr>
+          <w:cantSplit/>
+        </w:trPr>
+        <w:tc>
+          <w:tcPr>
+            <w:tcW w:type="dxa" w:w="2041"/>
+            <w:shd w:fill="F8F3F6"/>
+            <w:tcBorders>
+              <w:top w:val="single" w:sz="4" w:space="0" w:color="E3D9E0"/>
+              <w:left w:val="single" w:sz="4" w:space="0" w:color="E3D9E0"/>
+              <w:bottom w:val="single" w:sz="4" w:space="0" w:color="E3D9E0"/>
+              <w:right w:val="single" w:sz="4" w:space="0" w:color="E3D9E0"/>
+              <w:insideH w:val="single" w:sz="4" w:space="0" w:color="E3D9E0"/>
+              <w:insideV w:val="single" w:sz="4" w:space="0" w:color="E3D9E0"/>
+            </w:tcBorders>
+            <w:vAlign w:val="top"/>
+          </w:tcPr>
+          <w:p>
+            <w:pPr>
+              <w:spacing w:after="40"/>
+            </w:pPr>
+            <w:r>
+              <w:rPr>
+                <w:rFonts w:ascii="Liberation Sans" w:hAnsi="Liberation Sans"/>
+                <w:sz w:val="15"/>
+              </w:rPr>
+              <w:t>Public configuration</w:t>
+            </w:r>
+          </w:p>
+        </w:tc>
+        <w:tc>
+          <w:tcPr>
+            <w:tcW w:type="dxa" w:w="3118"/>
+            <w:shd w:fill="F8F3F6"/>
+            <w:tcBorders>
+              <w:top w:val="single" w:sz="4" w:space="0" w:color="E3D9E0"/>
+              <w:left w:val="single" w:sz="4" w:space="0" w:color="E3D9E0"/>
+              <w:bottom w:val="single" w:sz="4" w:space="0" w:color="E3D9E0"/>
+              <w:right w:val="single" w:sz="4" w:space="0" w:color="E3D9E0"/>
+              <w:insideH w:val="single" w:sz="4" w:space="0" w:color="E3D9E0"/>
+              <w:insideV w:val="single" w:sz="4" w:space="0" w:color="E3D9E0"/>
+            </w:tcBorders>
+            <w:vAlign w:val="top"/>
+          </w:tcPr>
+          <w:p>
+            <w:pPr>
+              <w:spacing w:after="40"/>
+            </w:pPr>
+            <w:r>
+              <w:rPr>
+                <w:rFonts w:ascii="Liberation Sans" w:hAnsi="Liberation Sans"/>
+                <w:sz w:val="15"/>
+              </w:rPr>
+              <w:t>site-config.js</w:t>
+            </w:r>
+          </w:p>
+        </w:tc>
+        <w:tc>
+          <w:tcPr>
+            <w:tcW w:type="dxa" w:w="4762"/>
+            <w:shd w:fill="F8F3F6"/>
+            <w:tcBorders>
+              <w:top w:val="single" w:sz="4" w:space="0" w:color="E3D9E0"/>
+              <w:left w:val="single" w:sz="4" w:space="0" w:color="E3D9E0"/>
+              <w:bottom w:val="single" w:sz="4" w:space="0" w:color="E3D9E0"/>
+              <w:right w:val="single" w:sz="4" w:space="0" w:color="E3D9E0"/>
+              <w:insideH w:val="single" w:sz="4" w:space="0" w:color="E3D9E0"/>
+              <w:insideV w:val="single" w:sz="4" w:space="0" w:color="E3D9E0"/>
+            </w:tcBorders>
+            <w:vAlign w:val="top"/>
+          </w:tcPr>
+          <w:p>
+            <w:pPr>
+              <w:spacing w:after="40"/>
+            </w:pPr>
+            <w:r>
+              <w:rPr>
+                <w:rFonts w:ascii="Liberation Sans" w:hAnsi="Liberation Sans"/>
+                <w:sz w:val="15"/>
+              </w:rPr>
+              <w:t>Contains only browser-safe project URL and publishable key values. Never put a service-role key or password in a public file.</w:t>
+            </w:r>
+          </w:p>
+        </w:tc>
+      </w:tr>
+    </w:tbl>
+    <w:p>
+      <w:pPr>
+        <w:spacing w:after="0"/>
+      </w:pPr>
+    </w:p>
+    <w:p>
+      <w:pPr>
+        <w:pStyle w:val="Heading2"/>
+        <w:keepNext/>
+      </w:pPr>
+      <w:r>
+        <w:t>16.1 Review, approve or remove feedback</w:t>
+      </w:r>
+    </w:p>
+    <w:p>
+      <w:pPr>
+        <w:spacing w:after="80"/>
+        <w:ind w:left="312" w:hanging="312"/>
+      </w:pPr>
+      <w:r>
+        <w:rPr>
+          <w:rFonts w:ascii="Liberation Sans" w:hAnsi="Liberation Sans"/>
+          <w:b/>
+        </w:rPr>
+        <w:t xml:space="preserve">1. </w:t>
+      </w:r>
+      <w:r>
+        <w:rPr>
+          <w:rFonts w:ascii="Liberation Sans" w:hAnsi="Liberation Sans"/>
+        </w:rPr>
+        <w:t>Sign in to the Elyra Suite admin portal using an authorized admin account.</w:t>
+      </w:r>
+    </w:p>
+    <w:p>
+      <w:pPr>
+        <w:spacing w:after="80"/>
+        <w:ind w:left="312" w:hanging="312"/>
+      </w:pPr>
+      <w:r>
+        <w:rPr>
+          <w:rFonts w:ascii="Liberation Sans" w:hAnsi="Liberation Sans"/>
+          <w:b/>
+        </w:rPr>
+        <w:t xml:space="preserve">2. </w:t>
+      </w:r>
+      <w:r>
+        <w:rPr>
+          <w:rFonts w:ascii="Liberation Sans" w:hAnsi="Liberation Sans"/>
+        </w:rPr>
+        <w:t>Open the Testimonials tab and inspect each submission.</w:t>
+      </w:r>
+    </w:p>
+    <w:p>
+      <w:pPr>
+        <w:spacing w:after="80"/>
+        <w:ind w:left="312" w:hanging="312"/>
+      </w:pPr>
+      <w:r>
+        <w:rPr>
+          <w:rFonts w:ascii="Liberation Sans" w:hAnsi="Liberation Sans"/>
+          <w:b/>
+        </w:rPr>
+        <w:t xml:space="preserve">3. </w:t>
+      </w:r>
+      <w:r>
+        <w:rPr>
+          <w:rFonts w:ascii="Liberation Sans" w:hAnsi="Liberation Sans"/>
+        </w:rPr>
+        <w:t>Approve only genuine client feedback when the client agreed that it can be published. Reject unsuitable submissions.</w:t>
+      </w:r>
+    </w:p>
+    <w:p>
+      <w:pPr>
+        <w:spacing w:after="80"/>
+        <w:ind w:left="312" w:hanging="312"/>
+      </w:pPr>
+      <w:r>
+        <w:rPr>
+          <w:rFonts w:ascii="Liberation Sans" w:hAnsi="Liberation Sans"/>
+          <w:b/>
+        </w:rPr>
+        <w:t xml:space="preserve">4. </w:t>
+      </w:r>
+      <w:r>
+        <w:rPr>
+          <w:rFonts w:ascii="Liberation Sans" w:hAnsi="Liberation Sans"/>
+        </w:rPr>
+        <w:t>Use unpublish or return-to-review controls if a published item must be hidden or reviewed again.</w:t>
+      </w:r>
+    </w:p>
+    <w:p>
+      <w:pPr>
+        <w:spacing w:after="80"/>
+        <w:ind w:left="312" w:hanging="312"/>
+      </w:pPr>
+      <w:r>
+        <w:rPr>
+          <w:rFonts w:ascii="Liberation Sans" w:hAnsi="Liberation Sans"/>
+          <w:b/>
+        </w:rPr>
+        <w:t xml:space="preserve">5. </w:t>
+      </w:r>
+      <w:r>
+        <w:rPr>
+          <w:rFonts w:ascii="Liberation Sans" w:hAnsi="Liberation Sans"/>
+        </w:rPr>
+        <w:t>Check the public Portfolio page after approval. Only approved feedback with publication consent should appear.</w:t>
+      </w:r>
+    </w:p>
+    <w:tbl>
+      <w:tblPr>
+        <w:tblW w:type="auto" w:w="0"/>
+        <w:jc w:val="center"/>
+        <w:tblLayout w:type="autofit"/>
+        <w:tblLook w:firstColumn="1" w:firstRow="1" w:lastColumn="0" w:lastRow="0" w:noHBand="0" w:noVBand="1" w:val="04A0"/>
+      </w:tblPr>
+      <w:tblGrid>
+        <w:gridCol w:w="9978"/>
+      </w:tblGrid>
+      <w:tr>
+        <w:trPr>
+          <w:cantSplit/>
+          <w:tblHeader w:val="true"/>
+        </w:trPr>
+        <w:tc>
+          <w:tcPr>
+            <w:tcW w:type="dxa" w:w="9978"/>
+            <w:shd w:fill="E8F4EA"/>
+            <w:tcBorders>
+              <w:top w:val="single" w:sz="4" w:space="0" w:color="D8CCD5"/>
+              <w:left w:val="single" w:sz="4" w:space="0" w:color="D8CCD5"/>
+              <w:bottom w:val="single" w:sz="4" w:space="0" w:color="D8CCD5"/>
+              <w:right w:val="single" w:sz="4" w:space="0" w:color="D8CCD5"/>
+              <w:insideH w:val="single" w:sz="4" w:space="0" w:color="D8CCD5"/>
+              <w:insideV w:val="single" w:sz="4" w:space="0" w:color="D8CCD5"/>
+            </w:tcBorders>
+          </w:tcPr>
+          <w:p>
+            <w:pPr>
+              <w:spacing w:after="0"/>
+            </w:pPr>
+            <w:r>
+              <w:rPr>
+                <w:rFonts w:ascii="Liberation Sans" w:hAnsi="Liberation Sans"/>
+                <w:b/>
+                <w:color w:val="4A235A"/>
+              </w:rPr>
+              <w:t>Evidence and consent</w:t>
+              <w:br/>
+            </w:r>
+            <w:r>
+              <w:rPr>
+                <w:rFonts w:ascii="Liberation Sans" w:hAnsi="Liberation Sans"/>
+                <w:color w:val="1A1A1A"/>
+              </w:rPr>
+              <w:t>Never invent testimonials, clients, outcomes, before-and-after results or review screenshots. Keep submissions private until approval. If a client withdraws permission, unpublish the feedback promptly.</w:t>
+            </w:r>
+          </w:p>
+        </w:tc>
+      </w:tr>
+    </w:tbl>
+    <w:p>
+      <w:pPr>
+        <w:spacing w:after="0"/>
+      </w:pPr>
+    </w:p>
+    <w:p>
+      <w:pPr>
+        <w:pStyle w:val="Heading2"/>
+        <w:keepNext/>
+      </w:pPr>
+      <w:r>
+        <w:t>16.2 Current system status</w:t>
+      </w:r>
+    </w:p>
+    <w:p>
+      <w:pPr>
+        <w:spacing w:after="140" w:line="276" w:lineRule="auto"/>
+      </w:pPr>
+      <w:r>
+        <w:rPr>
+          <w:rFonts w:ascii="Liberation Sans" w:hAnsi="Liberation Sans"/>
+        </w:rPr>
+        <w:t>The owner/client portal is now backed by Supabase authentication, account records and Row Level Security. The admin portal contains a review queue for client feedback. The site does not provide a public account-registration path. Product checkout and online payment processing are still not implemented.</w:t>
+      </w:r>
+    </w:p>
+    <w:tbl>
+      <w:tblPr>
+        <w:tblW w:type="auto" w:w="0"/>
+        <w:jc w:val="center"/>
+        <w:tblLayout w:type="fixed"/>
+        <w:tblLook w:firstColumn="1" w:firstRow="1" w:lastColumn="0" w:lastRow="0" w:noHBand="0" w:noVBand="1" w:val="04A0"/>
+      </w:tblPr>
+      <w:tblGrid>
+        <w:gridCol w:w="3326"/>
+        <w:gridCol w:w="3326"/>
+        <w:gridCol w:w="3326"/>
+      </w:tblGrid>
+      <w:tr>
+        <w:trPr>
+          <w:cantSplit/>
+          <w:tblHeader w:val="true"/>
+        </w:trPr>
+        <w:tc>
+          <w:tcPr>
+            <w:tcW w:type="dxa" w:w="2324"/>
+            <w:shd w:fill="4A235A"/>
+            <w:tcBorders>
+              <w:top w:val="single" w:sz="4" w:space="0" w:color="D8CCD5"/>
+              <w:left w:val="single" w:sz="4" w:space="0" w:color="D8CCD5"/>
+              <w:bottom w:val="single" w:sz="4" w:space="0" w:color="D8CCD5"/>
+              <w:right w:val="single" w:sz="4" w:space="0" w:color="D8CCD5"/>
+              <w:insideH w:val="single" w:sz="4" w:space="0" w:color="D8CCD5"/>
+              <w:insideV w:val="single" w:sz="4" w:space="0" w:color="D8CCD5"/>
+            </w:tcBorders>
+            <w:vAlign w:val="center"/>
+          </w:tcPr>
+          <w:p>
+            <w:pPr>
+              <w:jc w:val="left"/>
+            </w:pPr>
+            <w:r>
+              <w:rPr>
+                <w:rFonts w:ascii="Liberation Sans" w:hAnsi="Liberation Sans"/>
+                <w:b/>
+                <w:color w:val="FFFFFF"/>
+                <w:sz w:val="17"/>
+              </w:rPr>
+              <w:t>Feature</w:t>
+            </w:r>
+          </w:p>
+        </w:tc>
+        <w:tc>
+          <w:tcPr>
+            <w:tcW w:type="dxa" w:w="2154"/>
+            <w:shd w:fill="4A235A"/>
+            <w:tcBorders>
+              <w:top w:val="single" w:sz="4" w:space="0" w:color="D8CCD5"/>
+              <w:left w:val="single" w:sz="4" w:space="0" w:color="D8CCD5"/>
+              <w:bottom w:val="single" w:sz="4" w:space="0" w:color="D8CCD5"/>
+              <w:right w:val="single" w:sz="4" w:space="0" w:color="D8CCD5"/>
+              <w:insideH w:val="single" w:sz="4" w:space="0" w:color="D8CCD5"/>
+              <w:insideV w:val="single" w:sz="4" w:space="0" w:color="D8CCD5"/>
+            </w:tcBorders>
+            <w:vAlign w:val="center"/>
+          </w:tcPr>
+          <w:p>
+            <w:pPr>
+              <w:jc w:val="left"/>
+            </w:pPr>
+            <w:r>
+              <w:rPr>
+                <w:rFonts w:ascii="Liberation Sans" w:hAnsi="Liberation Sans"/>
+                <w:b/>
+                <w:color w:val="FFFFFF"/>
+                <w:sz w:val="17"/>
+              </w:rPr>
+              <w:t>Current status</w:t>
+            </w:r>
+          </w:p>
+        </w:tc>
+        <w:tc>
+          <w:tcPr>
+            <w:tcW w:type="dxa" w:w="5443"/>
+            <w:shd w:fill="4A235A"/>
+            <w:tcBorders>
+              <w:top w:val="single" w:sz="4" w:space="0" w:color="D8CCD5"/>
+              <w:left w:val="single" w:sz="4" w:space="0" w:color="D8CCD5"/>
+              <w:bottom w:val="single" w:sz="4" w:space="0" w:color="D8CCD5"/>
+              <w:right w:val="single" w:sz="4" w:space="0" w:color="D8CCD5"/>
+              <w:insideH w:val="single" w:sz="4" w:space="0" w:color="D8CCD5"/>
+              <w:insideV w:val="single" w:sz="4" w:space="0" w:color="D8CCD5"/>
+            </w:tcBorders>
+            <w:vAlign w:val="center"/>
+          </w:tcPr>
+          <w:p>
+            <w:pPr>
+              <w:jc w:val="left"/>
+            </w:pPr>
+            <w:r>
+              <w:rPr>
+                <w:rFonts w:ascii="Liberation Sans" w:hAnsi="Liberation Sans"/>
+                <w:b/>
+                <w:color w:val="FFFFFF"/>
+                <w:sz w:val="17"/>
+              </w:rPr>
+              <w:t>Meaning</w:t>
+            </w:r>
+          </w:p>
+        </w:tc>
+      </w:tr>
+      <w:tr>
+        <w:trPr>
+          <w:cantSplit/>
+        </w:trPr>
+        <w:tc>
+          <w:tcPr>
+            <w:tcW w:type="dxa" w:w="2324"/>
+            <w:shd w:fill="FFFFFF"/>
+            <w:tcBorders>
+              <w:top w:val="single" w:sz="4" w:space="0" w:color="E3D9E0"/>
+              <w:left w:val="single" w:sz="4" w:space="0" w:color="E3D9E0"/>
+              <w:bottom w:val="single" w:sz="4" w:space="0" w:color="E3D9E0"/>
+              <w:right w:val="single" w:sz="4" w:space="0" w:color="E3D9E0"/>
+              <w:insideH w:val="single" w:sz="4" w:space="0" w:color="E3D9E0"/>
+              <w:insideV w:val="single" w:sz="4" w:space="0" w:color="E3D9E0"/>
+            </w:tcBorders>
+            <w:vAlign w:val="top"/>
+          </w:tcPr>
+          <w:p>
+            <w:pPr>
+              <w:spacing w:after="40"/>
+            </w:pPr>
+            <w:r>
+              <w:rPr>
+                <w:rFonts w:ascii="Liberation Sans" w:hAnsi="Liberation Sans"/>
+                <w:sz w:val="15"/>
+              </w:rPr>
+              <w:t>Email and WhatsApp enquiries</w:t>
+            </w:r>
+          </w:p>
+        </w:tc>
+        <w:tc>
+          <w:tcPr>
+            <w:tcW w:type="dxa" w:w="2154"/>
+            <w:shd w:fill="FFFFFF"/>
+            <w:tcBorders>
+              <w:top w:val="single" w:sz="4" w:space="0" w:color="E3D9E0"/>
+              <w:left w:val="single" w:sz="4" w:space="0" w:color="E3D9E0"/>
+              <w:bottom w:val="single" w:sz="4" w:space="0" w:color="E3D9E0"/>
+              <w:right w:val="single" w:sz="4" w:space="0" w:color="E3D9E0"/>
+              <w:insideH w:val="single" w:sz="4" w:space="0" w:color="E3D9E0"/>
+              <w:insideV w:val="single" w:sz="4" w:space="0" w:color="E3D9E0"/>
+            </w:tcBorders>
+            <w:vAlign w:val="top"/>
+          </w:tcPr>
+          <w:p>
+            <w:pPr>
+              <w:spacing w:after="40"/>
+            </w:pPr>
+            <w:r>
+              <w:rPr>
+                <w:rFonts w:ascii="Liberation Sans" w:hAnsi="Liberation Sans"/>
+                <w:sz w:val="15"/>
+              </w:rPr>
+              <w:t>LIVE</w:t>
+            </w:r>
+          </w:p>
+        </w:tc>
+        <w:tc>
+          <w:tcPr>
+            <w:tcW w:type="dxa" w:w="5443"/>
+            <w:shd w:fill="FFFFFF"/>
+            <w:tcBorders>
+              <w:top w:val="single" w:sz="4" w:space="0" w:color="E3D9E0"/>
+              <w:left w:val="single" w:sz="4" w:space="0" w:color="E3D9E0"/>
+              <w:bottom w:val="single" w:sz="4" w:space="0" w:color="E3D9E0"/>
+              <w:right w:val="single" w:sz="4" w:space="0" w:color="E3D9E0"/>
+              <w:insideH w:val="single" w:sz="4" w:space="0" w:color="E3D9E0"/>
+              <w:insideV w:val="single" w:sz="4" w:space="0" w:color="E3D9E0"/>
+            </w:tcBorders>
+            <w:vAlign w:val="top"/>
+          </w:tcPr>
+          <w:p>
+            <w:pPr>
+              <w:spacing w:after="40"/>
+            </w:pPr>
+            <w:r>
+              <w:rPr>
+                <w:rFonts w:ascii="Liberation Sans" w:hAnsi="Liberation Sans"/>
+                <w:sz w:val="15"/>
+              </w:rPr>
+              <w:t>Email is primary; WhatsApp is secondary.</w:t>
+            </w:r>
+          </w:p>
+        </w:tc>
+      </w:tr>
+      <w:tr>
+        <w:trPr>
+          <w:cantSplit/>
+        </w:trPr>
+        <w:tc>
+          <w:tcPr>
+            <w:tcW w:type="dxa" w:w="2324"/>
+            <w:shd w:fill="F8F3F6"/>
+            <w:tcBorders>
+              <w:top w:val="single" w:sz="4" w:space="0" w:color="E3D9E0"/>
+              <w:left w:val="single" w:sz="4" w:space="0" w:color="E3D9E0"/>
+              <w:bottom w:val="single" w:sz="4" w:space="0" w:color="E3D9E0"/>
+              <w:right w:val="single" w:sz="4" w:space="0" w:color="E3D9E0"/>
+              <w:insideH w:val="single" w:sz="4" w:space="0" w:color="E3D9E0"/>
+              <w:insideV w:val="single" w:sz="4" w:space="0" w:color="E3D9E0"/>
+            </w:tcBorders>
+            <w:vAlign w:val="top"/>
+          </w:tcPr>
+          <w:p>
+            <w:pPr>
+              <w:spacing w:after="40"/>
+            </w:pPr>
+            <w:r>
+              <w:rPr>
+                <w:rFonts w:ascii="Liberation Sans" w:hAnsi="Liberation Sans"/>
+                <w:sz w:val="15"/>
+              </w:rPr>
+              <w:t>GitHub Pages hosting</w:t>
+            </w:r>
+          </w:p>
+        </w:tc>
+        <w:tc>
+          <w:tcPr>
+            <w:tcW w:type="dxa" w:w="2154"/>
+            <w:shd w:fill="F8F3F6"/>
+            <w:tcBorders>
+              <w:top w:val="single" w:sz="4" w:space="0" w:color="E3D9E0"/>
+              <w:left w:val="single" w:sz="4" w:space="0" w:color="E3D9E0"/>
+              <w:bottom w:val="single" w:sz="4" w:space="0" w:color="E3D9E0"/>
+              <w:right w:val="single" w:sz="4" w:space="0" w:color="E3D9E0"/>
+              <w:insideH w:val="single" w:sz="4" w:space="0" w:color="E3D9E0"/>
+              <w:insideV w:val="single" w:sz="4" w:space="0" w:color="E3D9E0"/>
+            </w:tcBorders>
+            <w:vAlign w:val="top"/>
+          </w:tcPr>
+          <w:p>
+            <w:pPr>
+              <w:spacing w:after="40"/>
+            </w:pPr>
+            <w:r>
+              <w:rPr>
+                <w:rFonts w:ascii="Liberation Sans" w:hAnsi="Liberation Sans"/>
+                <w:sz w:val="15"/>
+              </w:rPr>
+              <w:t>LIVE</w:t>
+            </w:r>
+          </w:p>
+        </w:tc>
+        <w:tc>
+          <w:tcPr>
+            <w:tcW w:type="dxa" w:w="5443"/>
+            <w:shd w:fill="F8F3F6"/>
+            <w:tcBorders>
+              <w:top w:val="single" w:sz="4" w:space="0" w:color="E3D9E0"/>
+              <w:left w:val="single" w:sz="4" w:space="0" w:color="E3D9E0"/>
+              <w:bottom w:val="single" w:sz="4" w:space="0" w:color="E3D9E0"/>
+              <w:right w:val="single" w:sz="4" w:space="0" w:color="E3D9E0"/>
+              <w:insideH w:val="single" w:sz="4" w:space="0" w:color="E3D9E0"/>
+              <w:insideV w:val="single" w:sz="4" w:space="0" w:color="E3D9E0"/>
+            </w:tcBorders>
+            <w:vAlign w:val="top"/>
+          </w:tcPr>
+          <w:p>
+            <w:pPr>
+              <w:spacing w:after="40"/>
+            </w:pPr>
+            <w:r>
+              <w:rPr>
+                <w:rFonts w:ascii="Liberation Sans" w:hAnsi="Liberation Sans"/>
+                <w:sz w:val="15"/>
+              </w:rPr>
+              <w:t>Changes on main trigger a GitHub Actions deployment.</w:t>
+            </w:r>
+          </w:p>
+        </w:tc>
+      </w:tr>
+      <w:tr>
+        <w:trPr>
+          <w:cantSplit/>
+        </w:trPr>
+        <w:tc>
+          <w:tcPr>
+            <w:tcW w:type="dxa" w:w="2324"/>
+            <w:shd w:fill="FFFFFF"/>
+            <w:tcBorders>
+              <w:top w:val="single" w:sz="4" w:space="0" w:color="E3D9E0"/>
+              <w:left w:val="single" w:sz="4" w:space="0" w:color="E3D9E0"/>
+              <w:bottom w:val="single" w:sz="4" w:space="0" w:color="E3D9E0"/>
+              <w:right w:val="single" w:sz="4" w:space="0" w:color="E3D9E0"/>
+              <w:insideH w:val="single" w:sz="4" w:space="0" w:color="E3D9E0"/>
+              <w:insideV w:val="single" w:sz="4" w:space="0" w:color="E3D9E0"/>
+            </w:tcBorders>
+            <w:vAlign w:val="top"/>
+          </w:tcPr>
+          <w:p>
+            <w:pPr>
+              <w:spacing w:after="40"/>
+            </w:pPr>
+            <w:r>
+              <w:rPr>
+                <w:rFonts w:ascii="Liberation Sans" w:hAnsi="Liberation Sans"/>
+                <w:sz w:val="15"/>
+              </w:rPr>
+              <w:t>Responsive layout and policy pages</w:t>
+            </w:r>
+          </w:p>
+        </w:tc>
+        <w:tc>
+          <w:tcPr>
+            <w:tcW w:type="dxa" w:w="2154"/>
+            <w:shd w:fill="FFFFFF"/>
+            <w:tcBorders>
+              <w:top w:val="single" w:sz="4" w:space="0" w:color="E3D9E0"/>
+              <w:left w:val="single" w:sz="4" w:space="0" w:color="E3D9E0"/>
+              <w:bottom w:val="single" w:sz="4" w:space="0" w:color="E3D9E0"/>
+              <w:right w:val="single" w:sz="4" w:space="0" w:color="E3D9E0"/>
+              <w:insideH w:val="single" w:sz="4" w:space="0" w:color="E3D9E0"/>
+              <w:insideV w:val="single" w:sz="4" w:space="0" w:color="E3D9E0"/>
+            </w:tcBorders>
+            <w:vAlign w:val="top"/>
+          </w:tcPr>
+          <w:p>
+            <w:pPr>
+              <w:spacing w:after="40"/>
+            </w:pPr>
+            <w:r>
+              <w:rPr>
+                <w:rFonts w:ascii="Liberation Sans" w:hAnsi="Liberation Sans"/>
+                <w:sz w:val="15"/>
+              </w:rPr>
+              <w:t>LIVE</w:t>
+            </w:r>
+          </w:p>
+        </w:tc>
+        <w:tc>
+          <w:tcPr>
+            <w:tcW w:type="dxa" w:w="5443"/>
+            <w:shd w:fill="FFFFFF"/>
+            <w:tcBorders>
+              <w:top w:val="single" w:sz="4" w:space="0" w:color="E3D9E0"/>
+              <w:left w:val="single" w:sz="4" w:space="0" w:color="E3D9E0"/>
+              <w:bottom w:val="single" w:sz="4" w:space="0" w:color="E3D9E0"/>
+              <w:right w:val="single" w:sz="4" w:space="0" w:color="E3D9E0"/>
+              <w:insideH w:val="single" w:sz="4" w:space="0" w:color="E3D9E0"/>
+              <w:insideV w:val="single" w:sz="4" w:space="0" w:color="E3D9E0"/>
+            </w:tcBorders>
+            <w:vAlign w:val="top"/>
+          </w:tcPr>
+          <w:p>
+            <w:pPr>
+              <w:spacing w:after="40"/>
+            </w:pPr>
+            <w:r>
+              <w:rPr>
+                <w:rFonts w:ascii="Liberation Sans" w:hAnsi="Liberation Sans"/>
+                <w:sz w:val="15"/>
+              </w:rPr>
+              <w:t>Test service and policy page changes on mobile.</w:t>
+            </w:r>
+          </w:p>
+        </w:tc>
+      </w:tr>
+      <w:tr>
+        <w:trPr>
+          <w:cantSplit/>
+        </w:trPr>
+        <w:tc>
+          <w:tcPr>
+            <w:tcW w:type="dxa" w:w="2324"/>
+            <w:shd w:fill="F8F3F6"/>
+            <w:tcBorders>
+              <w:top w:val="single" w:sz="4" w:space="0" w:color="E3D9E0"/>
+              <w:left w:val="single" w:sz="4" w:space="0" w:color="E3D9E0"/>
+              <w:bottom w:val="single" w:sz="4" w:space="0" w:color="E3D9E0"/>
+              <w:right w:val="single" w:sz="4" w:space="0" w:color="E3D9E0"/>
+              <w:insideH w:val="single" w:sz="4" w:space="0" w:color="E3D9E0"/>
+              <w:insideV w:val="single" w:sz="4" w:space="0" w:color="E3D9E0"/>
+            </w:tcBorders>
+            <w:vAlign w:val="top"/>
+          </w:tcPr>
+          <w:p>
+            <w:pPr>
+              <w:spacing w:after="40"/>
+            </w:pPr>
+            <w:r>
+              <w:rPr>
+                <w:rFonts w:ascii="Liberation Sans" w:hAnsi="Liberation Sans"/>
+                <w:sz w:val="15"/>
+              </w:rPr>
+              <w:t>SEO metadata</w:t>
+            </w:r>
+          </w:p>
+        </w:tc>
+        <w:tc>
+          <w:tcPr>
+            <w:tcW w:type="dxa" w:w="2154"/>
+            <w:shd w:fill="F8F3F6"/>
+            <w:tcBorders>
+              <w:top w:val="single" w:sz="4" w:space="0" w:color="E3D9E0"/>
+              <w:left w:val="single" w:sz="4" w:space="0" w:color="E3D9E0"/>
+              <w:bottom w:val="single" w:sz="4" w:space="0" w:color="E3D9E0"/>
+              <w:right w:val="single" w:sz="4" w:space="0" w:color="E3D9E0"/>
+              <w:insideH w:val="single" w:sz="4" w:space="0" w:color="E3D9E0"/>
+              <w:insideV w:val="single" w:sz="4" w:space="0" w:color="E3D9E0"/>
+            </w:tcBorders>
+            <w:vAlign w:val="top"/>
+          </w:tcPr>
+          <w:p>
+            <w:pPr>
+              <w:spacing w:after="40"/>
+            </w:pPr>
+            <w:r>
+              <w:rPr>
+                <w:rFonts w:ascii="Liberation Sans" w:hAnsi="Liberation Sans"/>
+                <w:sz w:val="15"/>
+              </w:rPr>
+              <w:t>LIVE</w:t>
+            </w:r>
+          </w:p>
+        </w:tc>
+        <w:tc>
+          <w:tcPr>
+            <w:tcW w:type="dxa" w:w="5443"/>
+            <w:shd w:fill="F8F3F6"/>
+            <w:tcBorders>
+              <w:top w:val="single" w:sz="4" w:space="0" w:color="E3D9E0"/>
+              <w:left w:val="single" w:sz="4" w:space="0" w:color="E3D9E0"/>
+              <w:bottom w:val="single" w:sz="4" w:space="0" w:color="E3D9E0"/>
+              <w:right w:val="single" w:sz="4" w:space="0" w:color="E3D9E0"/>
+              <w:insideH w:val="single" w:sz="4" w:space="0" w:color="E3D9E0"/>
+              <w:insideV w:val="single" w:sz="4" w:space="0" w:color="E3D9E0"/>
+            </w:tcBorders>
+            <w:vAlign w:val="top"/>
+          </w:tcPr>
+          <w:p>
+            <w:pPr>
+              <w:spacing w:after="40"/>
+            </w:pPr>
+            <w:r>
+              <w:rPr>
+                <w:rFonts w:ascii="Liberation Sans" w:hAnsi="Liberation Sans"/>
+                <w:sz w:val="15"/>
+              </w:rPr>
+              <w:t>Route-specific metadata is generated from the current SEO configuration.</w:t>
+            </w:r>
+          </w:p>
+        </w:tc>
+      </w:tr>
+      <w:tr>
+        <w:trPr>
+          <w:cantSplit/>
+        </w:trPr>
+        <w:tc>
+          <w:tcPr>
+            <w:tcW w:type="dxa" w:w="2324"/>
+            <w:shd w:fill="FFFFFF"/>
+            <w:tcBorders>
+              <w:top w:val="single" w:sz="4" w:space="0" w:color="E3D9E0"/>
+              <w:left w:val="single" w:sz="4" w:space="0" w:color="E3D9E0"/>
+              <w:bottom w:val="single" w:sz="4" w:space="0" w:color="E3D9E0"/>
+              <w:right w:val="single" w:sz="4" w:space="0" w:color="E3D9E0"/>
+              <w:insideH w:val="single" w:sz="4" w:space="0" w:color="E3D9E0"/>
+              <w:insideV w:val="single" w:sz="4" w:space="0" w:color="E3D9E0"/>
+            </w:tcBorders>
+            <w:vAlign w:val="top"/>
+          </w:tcPr>
+          <w:p>
+            <w:pPr>
+              <w:spacing w:after="40"/>
+            </w:pPr>
+            <w:r>
+              <w:rPr>
+                <w:rFonts w:ascii="Liberation Sans" w:hAnsi="Liberation Sans"/>
+                <w:sz w:val="15"/>
+              </w:rPr>
+              <w:t>Analytics</w:t>
+            </w:r>
+          </w:p>
+        </w:tc>
+        <w:tc>
+          <w:tcPr>
+            <w:tcW w:type="dxa" w:w="2154"/>
+            <w:shd w:fill="FFFFFF"/>
+            <w:tcBorders>
+              <w:top w:val="single" w:sz="4" w:space="0" w:color="E3D9E0"/>
+              <w:left w:val="single" w:sz="4" w:space="0" w:color="E3D9E0"/>
+              <w:bottom w:val="single" w:sz="4" w:space="0" w:color="E3D9E0"/>
+              <w:right w:val="single" w:sz="4" w:space="0" w:color="E3D9E0"/>
+              <w:insideH w:val="single" w:sz="4" w:space="0" w:color="E3D9E0"/>
+              <w:insideV w:val="single" w:sz="4" w:space="0" w:color="E3D9E0"/>
+            </w:tcBorders>
+            <w:vAlign w:val="top"/>
+          </w:tcPr>
+          <w:p>
+            <w:pPr>
+              <w:spacing w:after="40"/>
+            </w:pPr>
+            <w:r>
+              <w:rPr>
+                <w:rFonts w:ascii="Liberation Sans" w:hAnsi="Liberation Sans"/>
+                <w:sz w:val="15"/>
+              </w:rPr>
+              <w:t>READY, NOT ACTIVE</w:t>
+            </w:r>
+          </w:p>
+        </w:tc>
+        <w:tc>
+          <w:tcPr>
+            <w:tcW w:type="dxa" w:w="5443"/>
+            <w:shd w:fill="FFFFFF"/>
+            <w:tcBorders>
+              <w:top w:val="single" w:sz="4" w:space="0" w:color="E3D9E0"/>
+              <w:left w:val="single" w:sz="4" w:space="0" w:color="E3D9E0"/>
+              <w:bottom w:val="single" w:sz="4" w:space="0" w:color="E3D9E0"/>
+              <w:right w:val="single" w:sz="4" w:space="0" w:color="E3D9E0"/>
+              <w:insideH w:val="single" w:sz="4" w:space="0" w:color="E3D9E0"/>
+              <w:insideV w:val="single" w:sz="4" w:space="0" w:color="E3D9E0"/>
+            </w:tcBorders>
+            <w:vAlign w:val="top"/>
+          </w:tcPr>
+          <w:p>
+            <w:pPr>
+              <w:spacing w:after="40"/>
+            </w:pPr>
+            <w:r>
+              <w:rPr>
+                <w:rFonts w:ascii="Liberation Sans" w:hAnsi="Liberation Sans"/>
+                <w:sz w:val="15"/>
+              </w:rPr>
+              <w:t>Only enter a real measurement ID after one is created.</w:t>
+            </w:r>
+          </w:p>
+        </w:tc>
+      </w:tr>
+      <w:tr>
+        <w:trPr>
+          <w:cantSplit/>
+        </w:trPr>
+        <w:tc>
+          <w:tcPr>
+            <w:tcW w:type="dxa" w:w="2324"/>
+            <w:shd w:fill="F8F3F6"/>
+            <w:tcBorders>
+              <w:top w:val="single" w:sz="4" w:space="0" w:color="E3D9E0"/>
+              <w:left w:val="single" w:sz="4" w:space="0" w:color="E3D9E0"/>
+              <w:bottom w:val="single" w:sz="4" w:space="0" w:color="E3D9E0"/>
+              <w:right w:val="single" w:sz="4" w:space="0" w:color="E3D9E0"/>
+              <w:insideH w:val="single" w:sz="4" w:space="0" w:color="E3D9E0"/>
+              <w:insideV w:val="single" w:sz="4" w:space="0" w:color="E3D9E0"/>
+            </w:tcBorders>
+            <w:vAlign w:val="top"/>
+          </w:tcPr>
+          <w:p>
+            <w:pPr>
+              <w:spacing w:after="40"/>
+            </w:pPr>
+            <w:r>
+              <w:rPr>
+                <w:rFonts w:ascii="Liberation Sans" w:hAnsi="Liberation Sans"/>
+                <w:sz w:val="15"/>
+              </w:rPr>
+              <w:t>Portfolio feedback</w:t>
+            </w:r>
+          </w:p>
+        </w:tc>
+        <w:tc>
+          <w:tcPr>
+            <w:tcW w:type="dxa" w:w="2154"/>
+            <w:shd w:fill="F8F3F6"/>
+            <w:tcBorders>
+              <w:top w:val="single" w:sz="4" w:space="0" w:color="E3D9E0"/>
+              <w:left w:val="single" w:sz="4" w:space="0" w:color="E3D9E0"/>
+              <w:bottom w:val="single" w:sz="4" w:space="0" w:color="E3D9E0"/>
+              <w:right w:val="single" w:sz="4" w:space="0" w:color="E3D9E0"/>
+              <w:insideH w:val="single" w:sz="4" w:space="0" w:color="E3D9E0"/>
+              <w:insideV w:val="single" w:sz="4" w:space="0" w:color="E3D9E0"/>
+            </w:tcBorders>
+            <w:vAlign w:val="top"/>
+          </w:tcPr>
+          <w:p>
+            <w:pPr>
+              <w:spacing w:after="40"/>
+            </w:pPr>
+            <w:r>
+              <w:rPr>
+                <w:rFonts w:ascii="Liberation Sans" w:hAnsi="Liberation Sans"/>
+                <w:sz w:val="15"/>
+              </w:rPr>
+              <w:t>LIVE — MODERATED</w:t>
+            </w:r>
+          </w:p>
+        </w:tc>
+        <w:tc>
+          <w:tcPr>
+            <w:tcW w:type="dxa" w:w="5443"/>
+            <w:shd w:fill="F8F3F6"/>
+            <w:tcBorders>
+              <w:top w:val="single" w:sz="4" w:space="0" w:color="E3D9E0"/>
+              <w:left w:val="single" w:sz="4" w:space="0" w:color="E3D9E0"/>
+              <w:bottom w:val="single" w:sz="4" w:space="0" w:color="E3D9E0"/>
+              <w:right w:val="single" w:sz="4" w:space="0" w:color="E3D9E0"/>
+              <w:insideH w:val="single" w:sz="4" w:space="0" w:color="E3D9E0"/>
+              <w:insideV w:val="single" w:sz="4" w:space="0" w:color="E3D9E0"/>
+            </w:tcBorders>
+            <w:vAlign w:val="top"/>
+          </w:tcPr>
+          <w:p>
+            <w:pPr>
+              <w:spacing w:after="40"/>
+            </w:pPr>
+            <w:r>
+              <w:rPr>
+                <w:rFonts w:ascii="Liberation Sans" w:hAnsi="Liberation Sans"/>
+                <w:sz w:val="15"/>
+              </w:rPr>
+              <w:t>Public form; only approved, consented feedback is visible. No fabricated review content.</w:t>
+            </w:r>
+          </w:p>
+        </w:tc>
+      </w:tr>
+      <w:tr>
+        <w:trPr>
+          <w:cantSplit/>
+        </w:trPr>
+        <w:tc>
+          <w:tcPr>
+            <w:tcW w:type="dxa" w:w="2324"/>
+            <w:shd w:fill="FFFFFF"/>
+            <w:tcBorders>
+              <w:top w:val="single" w:sz="4" w:space="0" w:color="E3D9E0"/>
+              <w:left w:val="single" w:sz="4" w:space="0" w:color="E3D9E0"/>
+              <w:bottom w:val="single" w:sz="4" w:space="0" w:color="E3D9E0"/>
+              <w:right w:val="single" w:sz="4" w:space="0" w:color="E3D9E0"/>
+              <w:insideH w:val="single" w:sz="4" w:space="0" w:color="E3D9E0"/>
+              <w:insideV w:val="single" w:sz="4" w:space="0" w:color="E3D9E0"/>
+            </w:tcBorders>
+            <w:vAlign w:val="top"/>
+          </w:tcPr>
+          <w:p>
+            <w:pPr>
+              <w:spacing w:after="40"/>
+            </w:pPr>
+            <w:r>
+              <w:rPr>
+                <w:rFonts w:ascii="Liberation Sans" w:hAnsi="Liberation Sans"/>
+                <w:sz w:val="15"/>
+              </w:rPr>
+              <w:t>Admin/client portal</w:t>
+            </w:r>
+          </w:p>
+        </w:tc>
+        <w:tc>
+          <w:tcPr>
+            <w:tcW w:type="dxa" w:w="2154"/>
+            <w:shd w:fill="FFFFFF"/>
+            <w:tcBorders>
+              <w:top w:val="single" w:sz="4" w:space="0" w:color="E3D9E0"/>
+              <w:left w:val="single" w:sz="4" w:space="0" w:color="E3D9E0"/>
+              <w:bottom w:val="single" w:sz="4" w:space="0" w:color="E3D9E0"/>
+              <w:right w:val="single" w:sz="4" w:space="0" w:color="E3D9E0"/>
+              <w:insideH w:val="single" w:sz="4" w:space="0" w:color="E3D9E0"/>
+              <w:insideV w:val="single" w:sz="4" w:space="0" w:color="E3D9E0"/>
+            </w:tcBorders>
+            <w:vAlign w:val="top"/>
+          </w:tcPr>
+          <w:p>
+            <w:pPr>
+              <w:spacing w:after="40"/>
+            </w:pPr>
+            <w:r>
+              <w:rPr>
+                <w:rFonts w:ascii="Liberation Sans" w:hAnsi="Liberation Sans"/>
+                <w:sz w:val="15"/>
+              </w:rPr>
+              <w:t>LIVE — AUTHENTICATED</w:t>
+            </w:r>
+          </w:p>
+        </w:tc>
+        <w:tc>
+          <w:tcPr>
+            <w:tcW w:type="dxa" w:w="5443"/>
+            <w:shd w:fill="FFFFFF"/>
+            <w:tcBorders>
+              <w:top w:val="single" w:sz="4" w:space="0" w:color="E3D9E0"/>
+              <w:left w:val="single" w:sz="4" w:space="0" w:color="E3D9E0"/>
+              <w:bottom w:val="single" w:sz="4" w:space="0" w:color="E3D9E0"/>
+              <w:right w:val="single" w:sz="4" w:space="0" w:color="E3D9E0"/>
+              <w:insideH w:val="single" w:sz="4" w:space="0" w:color="E3D9E0"/>
+              <w:insideV w:val="single" w:sz="4" w:space="0" w:color="E3D9E0"/>
+            </w:tcBorders>
+            <w:vAlign w:val="top"/>
+          </w:tcPr>
+          <w:p>
+            <w:pPr>
+              <w:spacing w:after="40"/>
+            </w:pPr>
+            <w:r>
+              <w:rPr>
+                <w:rFonts w:ascii="Liberation Sans" w:hAnsi="Liberation Sans"/>
+                <w:sz w:val="15"/>
+              </w:rPr>
+              <w:t>Supabase Auth and Row Level Security; access depends on assigned role/account.</w:t>
+            </w:r>
+          </w:p>
+        </w:tc>
+      </w:tr>
+      <w:tr>
+        <w:trPr>
+          <w:cantSplit/>
+        </w:trPr>
+        <w:tc>
+          <w:tcPr>
+            <w:tcW w:type="dxa" w:w="2324"/>
+            <w:shd w:fill="F8F3F6"/>
+            <w:tcBorders>
+              <w:top w:val="single" w:sz="4" w:space="0" w:color="E3D9E0"/>
+              <w:left w:val="single" w:sz="4" w:space="0" w:color="E3D9E0"/>
+              <w:bottom w:val="single" w:sz="4" w:space="0" w:color="E3D9E0"/>
+              <w:right w:val="single" w:sz="4" w:space="0" w:color="E3D9E0"/>
+              <w:insideH w:val="single" w:sz="4" w:space="0" w:color="E3D9E0"/>
+              <w:insideV w:val="single" w:sz="4" w:space="0" w:color="E3D9E0"/>
+            </w:tcBorders>
+            <w:vAlign w:val="top"/>
+          </w:tcPr>
+          <w:p>
+            <w:pPr>
+              <w:spacing w:after="40"/>
+            </w:pPr>
+            <w:r>
+              <w:rPr>
+                <w:rFonts w:ascii="Liberation Sans" w:hAnsi="Liberation Sans"/>
+                <w:sz w:val="15"/>
+              </w:rPr>
+              <w:t>Store checkout / online payments</w:t>
+            </w:r>
+          </w:p>
+        </w:tc>
+        <w:tc>
+          <w:tcPr>
+            <w:tcW w:type="dxa" w:w="2154"/>
+            <w:shd w:fill="F8F3F6"/>
+            <w:tcBorders>
+              <w:top w:val="single" w:sz="4" w:space="0" w:color="E3D9E0"/>
+              <w:left w:val="single" w:sz="4" w:space="0" w:color="E3D9E0"/>
+              <w:bottom w:val="single" w:sz="4" w:space="0" w:color="E3D9E0"/>
+              <w:right w:val="single" w:sz="4" w:space="0" w:color="E3D9E0"/>
+              <w:insideH w:val="single" w:sz="4" w:space="0" w:color="E3D9E0"/>
+              <w:insideV w:val="single" w:sz="4" w:space="0" w:color="E3D9E0"/>
+            </w:tcBorders>
+            <w:vAlign w:val="top"/>
+          </w:tcPr>
+          <w:p>
+            <w:pPr>
+              <w:spacing w:after="40"/>
+            </w:pPr>
+            <w:r>
+              <w:rPr>
+                <w:rFonts w:ascii="Liberation Sans" w:hAnsi="Liberation Sans"/>
+                <w:sz w:val="15"/>
+              </w:rPr>
+              <w:t>NOT IMPLEMENTED</w:t>
+            </w:r>
+          </w:p>
+        </w:tc>
+        <w:tc>
+          <w:tcPr>
+            <w:tcW w:type="dxa" w:w="5443"/>
+            <w:shd w:fill="F8F3F6"/>
+            <w:tcBorders>
+              <w:top w:val="single" w:sz="4" w:space="0" w:color="E3D9E0"/>
+              <w:left w:val="single" w:sz="4" w:space="0" w:color="E3D9E0"/>
+              <w:bottom w:val="single" w:sz="4" w:space="0" w:color="E3D9E0"/>
+              <w:right w:val="single" w:sz="4" w:space="0" w:color="E3D9E0"/>
+              <w:insideH w:val="single" w:sz="4" w:space="0" w:color="E3D9E0"/>
+              <w:insideV w:val="single" w:sz="4" w:space="0" w:color="E3D9E0"/>
+            </w:tcBorders>
+            <w:vAlign w:val="top"/>
+          </w:tcPr>
+          <w:p>
+            <w:pPr>
+              <w:spacing w:after="40"/>
+            </w:pPr>
+            <w:r>
+              <w:rPr>
+                <w:rFonts w:ascii="Liberation Sans" w:hAnsi="Liberation Sans"/>
+                <w:sz w:val="15"/>
+              </w:rPr>
+              <w:t>The store is enquiry-led; do not promise online checkout or payment processing.</w:t>
+            </w:r>
+          </w:p>
+        </w:tc>
+      </w:tr>
+      <w:tr>
+        <w:trPr>
+          <w:cantSplit/>
+        </w:trPr>
+        <w:tc>
+          <w:tcPr>
+            <w:tcW w:type="dxa" w:w="2324"/>
+            <w:shd w:fill="FFFFFF"/>
+            <w:tcBorders>
+              <w:top w:val="single" w:sz="4" w:space="0" w:color="E3D9E0"/>
+              <w:left w:val="single" w:sz="4" w:space="0" w:color="E3D9E0"/>
+              <w:bottom w:val="single" w:sz="4" w:space="0" w:color="E3D9E0"/>
+              <w:right w:val="single" w:sz="4" w:space="0" w:color="E3D9E0"/>
+              <w:insideH w:val="single" w:sz="4" w:space="0" w:color="E3D9E0"/>
+              <w:insideV w:val="single" w:sz="4" w:space="0" w:color="E3D9E0"/>
+            </w:tcBorders>
+            <w:vAlign w:val="top"/>
+          </w:tcPr>
+          <w:p>
+            <w:pPr>
+              <w:spacing w:after="40"/>
+            </w:pPr>
+            <w:r>
+              <w:rPr>
+                <w:rFonts w:ascii="Liberation Sans" w:hAnsi="Liberation Sans"/>
+                <w:sz w:val="15"/>
+              </w:rPr>
+              <w:t>Academy enrolment</w:t>
+            </w:r>
+          </w:p>
+        </w:tc>
+        <w:tc>
+          <w:tcPr>
+            <w:tcW w:type="dxa" w:w="2154"/>
+            <w:shd w:fill="FFFFFF"/>
+            <w:tcBorders>
+              <w:top w:val="single" w:sz="4" w:space="0" w:color="E3D9E0"/>
+              <w:left w:val="single" w:sz="4" w:space="0" w:color="E3D9E0"/>
+              <w:bottom w:val="single" w:sz="4" w:space="0" w:color="E3D9E0"/>
+              <w:right w:val="single" w:sz="4" w:space="0" w:color="E3D9E0"/>
+              <w:insideH w:val="single" w:sz="4" w:space="0" w:color="E3D9E0"/>
+              <w:insideV w:val="single" w:sz="4" w:space="0" w:color="E3D9E0"/>
+            </w:tcBorders>
+            <w:vAlign w:val="top"/>
+          </w:tcPr>
+          <w:p>
+            <w:pPr>
+              <w:spacing w:after="40"/>
+            </w:pPr>
+            <w:r>
+              <w:rPr>
+                <w:rFonts w:ascii="Liberation Sans" w:hAnsi="Liberation Sans"/>
+                <w:sz w:val="15"/>
+              </w:rPr>
+              <w:t>ENQUIRY-BASED</w:t>
+            </w:r>
+          </w:p>
+        </w:tc>
+        <w:tc>
+          <w:tcPr>
+            <w:tcW w:type="dxa" w:w="5443"/>
+            <w:shd w:fill="FFFFFF"/>
+            <w:tcBorders>
+              <w:top w:val="single" w:sz="4" w:space="0" w:color="E3D9E0"/>
+              <w:left w:val="single" w:sz="4" w:space="0" w:color="E3D9E0"/>
+              <w:bottom w:val="single" w:sz="4" w:space="0" w:color="E3D9E0"/>
+              <w:right w:val="single" w:sz="4" w:space="0" w:color="E3D9E0"/>
+              <w:insideH w:val="single" w:sz="4" w:space="0" w:color="E3D9E0"/>
+              <w:insideV w:val="single" w:sz="4" w:space="0" w:color="E3D9E0"/>
+            </w:tcBorders>
+            <w:vAlign w:val="top"/>
+          </w:tcPr>
+          <w:p>
+            <w:pPr>
+              <w:spacing w:after="40"/>
+            </w:pPr>
+            <w:r>
+              <w:rPr>
+                <w:rFonts w:ascii="Liberation Sans" w:hAnsi="Liberation Sans"/>
+                <w:sz w:val="15"/>
+              </w:rPr>
+              <w:t>No public student account system is documented.</w:t>
+            </w:r>
+          </w:p>
+        </w:tc>
+      </w:tr>
+      <w:tr>
+        <w:trPr>
+          <w:cantSplit/>
+        </w:trPr>
+        <w:tc>
+          <w:tcPr>
+            <w:tcW w:type="dxa" w:w="2324"/>
+            <w:shd w:fill="F8F3F6"/>
+            <w:tcBorders>
+              <w:top w:val="single" w:sz="4" w:space="0" w:color="E3D9E0"/>
+              <w:left w:val="single" w:sz="4" w:space="0" w:color="E3D9E0"/>
+              <w:bottom w:val="single" w:sz="4" w:space="0" w:color="E3D9E0"/>
+              <w:right w:val="single" w:sz="4" w:space="0" w:color="E3D9E0"/>
+              <w:insideH w:val="single" w:sz="4" w:space="0" w:color="E3D9E0"/>
+              <w:insideV w:val="single" w:sz="4" w:space="0" w:color="E3D9E0"/>
+            </w:tcBorders>
+            <w:vAlign w:val="top"/>
+          </w:tcPr>
+          <w:p>
+            <w:pPr>
+              <w:spacing w:after="40"/>
+            </w:pPr>
+            <w:r>
+              <w:rPr>
+                <w:rFonts w:ascii="Liberation Sans" w:hAnsi="Liberation Sans"/>
+                <w:sz w:val="15"/>
+              </w:rPr>
+              <w:t>Custom domain and professional email</w:t>
+            </w:r>
+          </w:p>
+        </w:tc>
+        <w:tc>
+          <w:tcPr>
+            <w:tcW w:type="dxa" w:w="2154"/>
+            <w:shd w:fill="F8F3F6"/>
+            <w:tcBorders>
+              <w:top w:val="single" w:sz="4" w:space="0" w:color="E3D9E0"/>
+              <w:left w:val="single" w:sz="4" w:space="0" w:color="E3D9E0"/>
+              <w:bottom w:val="single" w:sz="4" w:space="0" w:color="E3D9E0"/>
+              <w:right w:val="single" w:sz="4" w:space="0" w:color="E3D9E0"/>
+              <w:insideH w:val="single" w:sz="4" w:space="0" w:color="E3D9E0"/>
+              <w:insideV w:val="single" w:sz="4" w:space="0" w:color="E3D9E0"/>
+            </w:tcBorders>
+            <w:vAlign w:val="top"/>
+          </w:tcPr>
+          <w:p>
+            <w:pPr>
+              <w:spacing w:after="40"/>
+            </w:pPr>
+            <w:r>
+              <w:rPr>
+                <w:rFonts w:ascii="Liberation Sans" w:hAnsi="Liberation Sans"/>
+                <w:sz w:val="15"/>
+              </w:rPr>
+              <w:t>NOT CONNECTED</w:t>
+            </w:r>
+          </w:p>
+        </w:tc>
+        <w:tc>
+          <w:tcPr>
+            <w:tcW w:type="dxa" w:w="5443"/>
+            <w:shd w:fill="F8F3F6"/>
+            <w:tcBorders>
+              <w:top w:val="single" w:sz="4" w:space="0" w:color="E3D9E0"/>
+              <w:left w:val="single" w:sz="4" w:space="0" w:color="E3D9E0"/>
+              <w:bottom w:val="single" w:sz="4" w:space="0" w:color="E3D9E0"/>
+              <w:right w:val="single" w:sz="4" w:space="0" w:color="E3D9E0"/>
+              <w:insideH w:val="single" w:sz="4" w:space="0" w:color="E3D9E0"/>
+              <w:insideV w:val="single" w:sz="4" w:space="0" w:color="E3D9E0"/>
+            </w:tcBorders>
+            <w:vAlign w:val="top"/>
+          </w:tcPr>
+          <w:p>
+            <w:pPr>
+              <w:spacing w:after="40"/>
+            </w:pPr>
+            <w:r>
+              <w:rPr>
+                <w:rFonts w:ascii="Liberation Sans" w:hAnsi="Liberation Sans"/>
+                <w:sz w:val="15"/>
+              </w:rPr>
+              <w:t>Use the current GitHub Pages URL and Gmail.</w:t>
+            </w:r>
+          </w:p>
+        </w:tc>
+      </w:tr>
+    </w:tbl>
+    <w:p>
+      <w:pPr>
+        <w:spacing w:after="0"/>
+      </w:pPr>
+    </w:p>
+    <w:p>
+      <w:pPr>
+        <w:spacing w:after="140" w:line="276" w:lineRule="auto"/>
+      </w:pPr>
+      <w:r>
+        <w:rPr>
+          <w:rFonts w:ascii="Liberation Sans" w:hAnsi="Liberation Sans"/>
+        </w:rPr>
+        <w:t>Backend project ref: kqpbdagawllgonzoloao. Keep the Elyra database and its credentials separate from Eragonova. The GitHub Pages workflow uses the existing checked-in guide PDF if temporary guide decoding is not available.</w:t>
+      </w:r>
     </w:p>
     <w:sectPr>
       <w:footerReference w:type="default" r:id="rId9"/>

</xml_diff>

<commit_message>
Update Elyra Suite website owner handbook
</commit_message>
<xml_diff>
--- a/docs/Elyra_Suite_Website_Owners_Handbook.docx
+++ b/docs/Elyra_Suite_Website_Owners_Handbook.docx
@@ -7,40 +7,6 @@
         <w:spacing w:before="720"/>
         <w:jc w:val="center"/>
       </w:pPr>
-      <w:r>
-        <w:drawing>
-          <wp:inline xmlns:a="http://schemas.openxmlformats.org/drawingml/2006/main" xmlns:pic="http://schemas.openxmlformats.org/drawingml/2006/picture">
-            <wp:extent cx="2148840" cy="2148840"/>
-            <wp:docPr id="1" name="Picture 1"/>
-            <wp:cNvGraphicFramePr>
-              <a:graphicFrameLocks noChangeAspect="1"/>
-            </wp:cNvGraphicFramePr>
-            <a:graphic>
-              <a:graphicData uri="http://schemas.openxmlformats.org/drawingml/2006/picture">
-                <pic:pic>
-                  <pic:nvPicPr>
-                    <pic:cNvPr id="0" name="Elyra Suite Monogram Logo.png"/>
-                    <pic:cNvPicPr/>
-                  </pic:nvPicPr>
-                  <pic:blipFill>
-                    <a:blip r:embed="rId10"/>
-                    <a:stretch>
-                      <a:fillRect/>
-                    </a:stretch>
-                  </pic:blipFill>
-                  <pic:spPr>
-                    <a:xfrm>
-                      <a:off x="0" y="0"/>
-                      <a:ext cx="2148840" cy="2148840"/>
-                    </a:xfrm>
-                    <a:prstGeom prst="rect"/>
-                  </pic:spPr>
-                </pic:pic>
-              </a:graphicData>
-            </a:graphic>
-          </wp:inline>
-        </w:drawing>
-      </w:r>
     </w:p>
     <w:p>
       <w:pPr>
@@ -20727,8 +20693,8 @@
     </w:p>
     <w:sectPr>
       <w:footerReference w:type="default" r:id="rId9"/>
-      <w:headerReference w:type="default" r:id="rId11"/>
-      <w:footerReference w:type="first" r:id="rId12"/>
+      <w:headerReference w:type="default" r:id="rId10"/>
+      <w:footerReference w:type="first" r:id="rId11"/>
       <w:pgSz w:w="11906" w:h="16838"/>
       <w:pgMar w:top="964" w:right="964" w:bottom="907" w:left="964" w:header="720" w:footer="720" w:gutter="0"/>
       <w:cols w:space="720"/>

</xml_diff>